<commit_message>
Fix manuscript subfigure layout and titles
</commit_message>
<xml_diff>
--- a/paper/IntervalFuzzy-MetaGDM_manuscript_annotated.docx
+++ b/paper/IntervalFuzzy-MetaGDM_manuscript_annotated.docx
@@ -28745,185 +28745,304 @@
         <w:ind w:firstLine="420"/>
       </w:pPr>
     </w:p>
-    <w:p>
-      <w:pPr>
-        <w:keepNext/>
-        <w:keepLines/>
+    <w:tbl>
+      <w:tblPr>
+        <w:tblW w:type="dxa" w:w="9000"/>
         <w:jc w:val="center"/>
-      </w:pPr>
-      <w:r>
-        <w:rPr>
-          <w:noProof/>
-        </w:rPr>
-        <w:drawing>
-          <wp:inline distT="0" distB="0" distL="0" distR="0" wp14:anchorId="232D4B98" wp14:editId="1BB9D9FE">
-            <wp:extent cx="1371600" cy="1887088"/>
-            <wp:effectExtent l="0" t="0" r="0" b="0"/>
-            <wp:docPr id="170737790" name="Figure 6(a)" descr="图6(a) 成功率"/>
-            <wp:cNvGraphicFramePr>
-              <a:graphicFrameLocks xmlns:a="http://schemas.openxmlformats.org/drawingml/2006/main" noChangeAspect="1"/>
-            </wp:cNvGraphicFramePr>
-            <a:graphic xmlns:a="http://schemas.openxmlformats.org/drawingml/2006/main">
-              <a:graphicData uri="http://schemas.openxmlformats.org/drawingml/2006/picture">
-                <pic:pic xmlns:pic="http://schemas.openxmlformats.org/drawingml/2006/picture">
-                  <pic:nvPicPr>
-                    <pic:cNvPr id="0" name="figure6_a.png"/>
-                    <pic:cNvPicPr/>
-                  </pic:nvPicPr>
-                  <pic:blipFill>
-                    <a:blip r:embed="rId20"/>
-                    <a:stretch>
-                      <a:fillRect/>
-                    </a:stretch>
-                  </pic:blipFill>
-                  <pic:spPr>
-                    <a:xfrm>
-                      <a:off x="0" y="0"/>
-                      <a:ext cx="1371600" cy="1887088"/>
-                    </a:xfrm>
-                    <a:prstGeom prst="rect">
-                      <a:avLst/>
-                    </a:prstGeom>
-                  </pic:spPr>
-                </pic:pic>
-              </a:graphicData>
-            </a:graphic>
-          </wp:inline>
-        </w:drawing>
-      </w:r>
-      <w:r>
-        <w:t xml:space="preserve"> </w:t>
-      </w:r>
-      <w:r>
-        <w:rPr>
-          <w:noProof/>
-        </w:rPr>
-        <w:drawing>
-          <wp:inline distT="0" distB="0" distL="0" distR="0" wp14:anchorId="43EC9B99" wp14:editId="671A0A81">
-            <wp:extent cx="1371600" cy="1887088"/>
-            <wp:effectExtent l="0" t="0" r="0" b="0"/>
-            <wp:docPr id="170737791" name="Figure 6(b)" descr="图6(b) 平均收敛轮数"/>
-            <wp:cNvGraphicFramePr>
-              <a:graphicFrameLocks xmlns:a="http://schemas.openxmlformats.org/drawingml/2006/main" noChangeAspect="1"/>
-            </wp:cNvGraphicFramePr>
-            <a:graphic xmlns:a="http://schemas.openxmlformats.org/drawingml/2006/main">
-              <a:graphicData uri="http://schemas.openxmlformats.org/drawingml/2006/picture">
-                <pic:pic xmlns:pic="http://schemas.openxmlformats.org/drawingml/2006/picture">
-                  <pic:nvPicPr>
-                    <pic:cNvPr id="0" name="figure6_b.png"/>
-                    <pic:cNvPicPr/>
-                  </pic:nvPicPr>
-                  <pic:blipFill>
-                    <a:blip r:embed="rId21"/>
-                    <a:stretch>
-                      <a:fillRect/>
-                    </a:stretch>
-                  </pic:blipFill>
-                  <pic:spPr>
-                    <a:xfrm>
-                      <a:off x="0" y="0"/>
-                      <a:ext cx="1371600" cy="1887088"/>
-                    </a:xfrm>
-                    <a:prstGeom prst="rect">
-                      <a:avLst/>
-                    </a:prstGeom>
-                  </pic:spPr>
-                </pic:pic>
-              </a:graphicData>
-            </a:graphic>
-          </wp:inline>
-        </w:drawing>
-      </w:r>
-      <w:r>
-        <w:t xml:space="preserve"> </w:t>
-      </w:r>
-      <w:r>
-        <w:rPr>
-          <w:noProof/>
-        </w:rPr>
-        <w:drawing>
-          <wp:inline distT="0" distB="0" distL="0" distR="0" wp14:anchorId="6D11F377" wp14:editId="64B61F0E">
-            <wp:extent cx="1371600" cy="1887088"/>
-            <wp:effectExtent l="0" t="0" r="0" b="0"/>
-            <wp:docPr id="170737792" name="Figure 6(c)" descr="图6(c) 人均调整成本"/>
-            <wp:cNvGraphicFramePr>
-              <a:graphicFrameLocks xmlns:a="http://schemas.openxmlformats.org/drawingml/2006/main" noChangeAspect="1"/>
-            </wp:cNvGraphicFramePr>
-            <a:graphic xmlns:a="http://schemas.openxmlformats.org/drawingml/2006/main">
-              <a:graphicData uri="http://schemas.openxmlformats.org/drawingml/2006/picture">
-                <pic:pic xmlns:pic="http://schemas.openxmlformats.org/drawingml/2006/picture">
-                  <pic:nvPicPr>
-                    <pic:cNvPr id="0" name="figure6_c.png"/>
-                    <pic:cNvPicPr/>
-                  </pic:nvPicPr>
-                  <pic:blipFill>
-                    <a:blip r:embed="rId22"/>
-                    <a:stretch>
-                      <a:fillRect/>
-                    </a:stretch>
-                  </pic:blipFill>
-                  <pic:spPr>
-                    <a:xfrm>
-                      <a:off x="0" y="0"/>
-                      <a:ext cx="1371600" cy="1887088"/>
-                    </a:xfrm>
-                    <a:prstGeom prst="rect">
-                      <a:avLst/>
-                    </a:prstGeom>
-                  </pic:spPr>
-                </pic:pic>
-              </a:graphicData>
-            </a:graphic>
-          </wp:inline>
-        </w:drawing>
-      </w:r>
-      <w:r>
-        <w:t xml:space="preserve"> </w:t>
-      </w:r>
-      <w:r>
-        <w:rPr>
-          <w:noProof/>
-        </w:rPr>
-        <w:drawing>
-          <wp:inline distT="0" distB="0" distL="0" distR="0" wp14:anchorId="39D23B9F" wp14:editId="51460CF1">
-            <wp:extent cx="1371600" cy="1887088"/>
-            <wp:effectExtent l="0" t="0" r="0" b="0"/>
-            <wp:docPr id="170737793" name="Figure 6(d)" descr="图6(d) 平均回合奖励"/>
-            <wp:cNvGraphicFramePr>
-              <a:graphicFrameLocks xmlns:a="http://schemas.openxmlformats.org/drawingml/2006/main" noChangeAspect="1"/>
-            </wp:cNvGraphicFramePr>
-            <a:graphic xmlns:a="http://schemas.openxmlformats.org/drawingml/2006/main">
-              <a:graphicData uri="http://schemas.openxmlformats.org/drawingml/2006/picture">
-                <pic:pic xmlns:pic="http://schemas.openxmlformats.org/drawingml/2006/picture">
-                  <pic:nvPicPr>
-                    <pic:cNvPr id="0" name="figure6_d.png"/>
-                    <pic:cNvPicPr/>
-                  </pic:nvPicPr>
-                  <pic:blipFill>
-                    <a:blip r:embed="rId23"/>
-                    <a:stretch>
-                      <a:fillRect/>
-                    </a:stretch>
-                  </pic:blipFill>
-                  <pic:spPr>
-                    <a:xfrm>
-                      <a:off x="0" y="0"/>
-                      <a:ext cx="1371600" cy="1887088"/>
-                    </a:xfrm>
-                    <a:prstGeom prst="rect">
-                      <a:avLst/>
-                    </a:prstGeom>
-                  </pic:spPr>
-                </pic:pic>
-              </a:graphicData>
-            </a:graphic>
-          </wp:inline>
-        </w:drawing>
-      </w:r>
-    </w:p>
+        <w:tblLayout w:type="fixed"/>
+        <w:tblLook w:firstColumn="1" w:firstRow="1" w:lastColumn="0" w:lastRow="0" w:noHBand="0" w:noVBand="1" w:val="04A0"/>
+        <w:tblBorders>
+          <w:top w:val="nil"/>
+          <w:left w:val="nil"/>
+          <w:bottom w:val="nil"/>
+          <w:right w:val="nil"/>
+          <w:insideH w:val="nil"/>
+          <w:insideV w:val="nil"/>
+        </w:tblBorders>
+      </w:tblPr>
+      <w:tblGrid>
+        <w:gridCol w:w="4500"/>
+        <w:gridCol w:w="4500"/>
+      </w:tblGrid>
+      <w:tr>
+        <w:trPr>
+          <w:cantSplit/>
+        </w:trPr>
+        <w:tc>
+          <w:tcPr>
+            <w:tcW w:type="dxa" w:w="4500"/>
+            <w:vAlign w:val="center"/>
+            <w:tcMar>
+              <w:top w:w="40" w:type="dxa"/>
+              <w:start w:w="40" w:type="dxa"/>
+              <w:bottom w:w="20" w:type="dxa"/>
+              <w:end w:w="40" w:type="dxa"/>
+            </w:tcMar>
+          </w:tcPr>
+          <w:p>
+            <w:pPr>
+              <w:spacing w:before="0" w:after="0" w:line="240" w:lineRule="auto"/>
+              <w:jc w:val="center"/>
+            </w:pPr>
+            <w:r>
+              <w:drawing>
+                <wp:inline xmlns:a="http://schemas.openxmlformats.org/drawingml/2006/main" xmlns:pic="http://schemas.openxmlformats.org/drawingml/2006/picture">
+                  <wp:extent cx="2615184" cy="1898826"/>
+                  <wp:docPr id="170737810" name="Figure 6(a)" descr="图6(a) 成功率"/>
+                  <wp:cNvGraphicFramePr>
+                    <a:graphicFrameLocks noChangeAspect="1"/>
+                  </wp:cNvGraphicFramePr>
+                  <a:graphic>
+                    <a:graphicData uri="http://schemas.openxmlformats.org/drawingml/2006/picture">
+                      <pic:pic>
+                        <pic:nvPicPr>
+                          <pic:cNvPr id="0" name="figure6_a.png"/>
+                          <pic:cNvPicPr/>
+                        </pic:nvPicPr>
+                        <pic:blipFill>
+                          <a:blip r:embed="rId70"/>
+                          <a:stretch>
+                            <a:fillRect/>
+                          </a:stretch>
+                        </pic:blipFill>
+                        <pic:spPr>
+                          <a:xfrm>
+                            <a:off x="0" y="0"/>
+                            <a:ext cx="2615184" cy="1898826"/>
+                          </a:xfrm>
+                          <a:prstGeom prst="rect"/>
+                        </pic:spPr>
+                      </pic:pic>
+                    </a:graphicData>
+                  </a:graphic>
+                </wp:inline>
+              </w:drawing>
+            </w:r>
+          </w:p>
+          <w:p>
+            <w:pPr>
+              <w:spacing w:before="0" w:after="40" w:line="240" w:lineRule="auto"/>
+              <w:jc w:val="center"/>
+            </w:pPr>
+            <w:r>
+              <w:rPr>
+                <w:rFonts w:ascii="Times New Roman" w:hAnsi="Times New Roman"/>
+                <w:b/>
+                <w:sz w:val="19"/>
+              </w:rPr>
+              <w:t>(a)</w:t>
+            </w:r>
+          </w:p>
+        </w:tc>
+        <w:tc>
+          <w:tcPr>
+            <w:tcW w:type="dxa" w:w="4500"/>
+            <w:vAlign w:val="center"/>
+            <w:tcMar>
+              <w:top w:w="40" w:type="dxa"/>
+              <w:start w:w="40" w:type="dxa"/>
+              <w:bottom w:w="20" w:type="dxa"/>
+              <w:end w:w="40" w:type="dxa"/>
+            </w:tcMar>
+          </w:tcPr>
+          <w:p>
+            <w:pPr>
+              <w:spacing w:before="0" w:after="0" w:line="240" w:lineRule="auto"/>
+              <w:jc w:val="center"/>
+            </w:pPr>
+            <w:r>
+              <w:drawing>
+                <wp:inline xmlns:a="http://schemas.openxmlformats.org/drawingml/2006/main" xmlns:pic="http://schemas.openxmlformats.org/drawingml/2006/picture">
+                  <wp:extent cx="2615184" cy="1898826"/>
+                  <wp:docPr id="170737811" name="Figure 6(b)" descr="图6(b) 平均收敛轮数"/>
+                  <wp:cNvGraphicFramePr>
+                    <a:graphicFrameLocks noChangeAspect="1"/>
+                  </wp:cNvGraphicFramePr>
+                  <a:graphic>
+                    <a:graphicData uri="http://schemas.openxmlformats.org/drawingml/2006/picture">
+                      <pic:pic>
+                        <pic:nvPicPr>
+                          <pic:cNvPr id="0" name="figure6_b.png"/>
+                          <pic:cNvPicPr/>
+                        </pic:nvPicPr>
+                        <pic:blipFill>
+                          <a:blip r:embed="rId71"/>
+                          <a:stretch>
+                            <a:fillRect/>
+                          </a:stretch>
+                        </pic:blipFill>
+                        <pic:spPr>
+                          <a:xfrm>
+                            <a:off x="0" y="0"/>
+                            <a:ext cx="2615184" cy="1898826"/>
+                          </a:xfrm>
+                          <a:prstGeom prst="rect"/>
+                        </pic:spPr>
+                      </pic:pic>
+                    </a:graphicData>
+                  </a:graphic>
+                </wp:inline>
+              </w:drawing>
+            </w:r>
+          </w:p>
+          <w:p>
+            <w:pPr>
+              <w:spacing w:before="0" w:after="40" w:line="240" w:lineRule="auto"/>
+              <w:jc w:val="center"/>
+            </w:pPr>
+            <w:r>
+              <w:rPr>
+                <w:rFonts w:ascii="Times New Roman" w:hAnsi="Times New Roman"/>
+                <w:b/>
+                <w:sz w:val="19"/>
+              </w:rPr>
+              <w:t>(b)</w:t>
+            </w:r>
+          </w:p>
+        </w:tc>
+      </w:tr>
+      <w:tr>
+        <w:trPr>
+          <w:cantSplit/>
+        </w:trPr>
+        <w:tc>
+          <w:tcPr>
+            <w:tcW w:type="dxa" w:w="4500"/>
+            <w:vAlign w:val="center"/>
+            <w:tcMar>
+              <w:top w:w="40" w:type="dxa"/>
+              <w:start w:w="40" w:type="dxa"/>
+              <w:bottom w:w="20" w:type="dxa"/>
+              <w:end w:w="40" w:type="dxa"/>
+            </w:tcMar>
+          </w:tcPr>
+          <w:p>
+            <w:pPr>
+              <w:spacing w:before="0" w:after="0" w:line="240" w:lineRule="auto"/>
+              <w:jc w:val="center"/>
+            </w:pPr>
+            <w:r>
+              <w:drawing>
+                <wp:inline xmlns:a="http://schemas.openxmlformats.org/drawingml/2006/main" xmlns:pic="http://schemas.openxmlformats.org/drawingml/2006/picture">
+                  <wp:extent cx="2615184" cy="1898826"/>
+                  <wp:docPr id="170737812" name="Figure 6(c)" descr="图6(c) 人均调整成本"/>
+                  <wp:cNvGraphicFramePr>
+                    <a:graphicFrameLocks noChangeAspect="1"/>
+                  </wp:cNvGraphicFramePr>
+                  <a:graphic>
+                    <a:graphicData uri="http://schemas.openxmlformats.org/drawingml/2006/picture">
+                      <pic:pic>
+                        <pic:nvPicPr>
+                          <pic:cNvPr id="0" name="figure6_c.png"/>
+                          <pic:cNvPicPr/>
+                        </pic:nvPicPr>
+                        <pic:blipFill>
+                          <a:blip r:embed="rId72"/>
+                          <a:stretch>
+                            <a:fillRect/>
+                          </a:stretch>
+                        </pic:blipFill>
+                        <pic:spPr>
+                          <a:xfrm>
+                            <a:off x="0" y="0"/>
+                            <a:ext cx="2615184" cy="1898826"/>
+                          </a:xfrm>
+                          <a:prstGeom prst="rect"/>
+                        </pic:spPr>
+                      </pic:pic>
+                    </a:graphicData>
+                  </a:graphic>
+                </wp:inline>
+              </w:drawing>
+            </w:r>
+          </w:p>
+          <w:p>
+            <w:pPr>
+              <w:spacing w:before="0" w:after="40" w:line="240" w:lineRule="auto"/>
+              <w:jc w:val="center"/>
+            </w:pPr>
+            <w:r>
+              <w:rPr>
+                <w:rFonts w:ascii="Times New Roman" w:hAnsi="Times New Roman"/>
+                <w:b/>
+                <w:sz w:val="19"/>
+              </w:rPr>
+              <w:t>(c)</w:t>
+            </w:r>
+          </w:p>
+        </w:tc>
+        <w:tc>
+          <w:tcPr>
+            <w:tcW w:type="dxa" w:w="4500"/>
+            <w:vAlign w:val="center"/>
+            <w:tcMar>
+              <w:top w:w="40" w:type="dxa"/>
+              <w:start w:w="40" w:type="dxa"/>
+              <w:bottom w:w="20" w:type="dxa"/>
+              <w:end w:w="40" w:type="dxa"/>
+            </w:tcMar>
+          </w:tcPr>
+          <w:p>
+            <w:pPr>
+              <w:spacing w:before="0" w:after="0" w:line="240" w:lineRule="auto"/>
+              <w:jc w:val="center"/>
+            </w:pPr>
+            <w:r>
+              <w:drawing>
+                <wp:inline xmlns:a="http://schemas.openxmlformats.org/drawingml/2006/main" xmlns:pic="http://schemas.openxmlformats.org/drawingml/2006/picture">
+                  <wp:extent cx="2615184" cy="1898826"/>
+                  <wp:docPr id="170737813" name="Figure 6(d)" descr="图6(d) 平均回合奖励"/>
+                  <wp:cNvGraphicFramePr>
+                    <a:graphicFrameLocks noChangeAspect="1"/>
+                  </wp:cNvGraphicFramePr>
+                  <a:graphic>
+                    <a:graphicData uri="http://schemas.openxmlformats.org/drawingml/2006/picture">
+                      <pic:pic>
+                        <pic:nvPicPr>
+                          <pic:cNvPr id="0" name="figure6_d.png"/>
+                          <pic:cNvPicPr/>
+                        </pic:nvPicPr>
+                        <pic:blipFill>
+                          <a:blip r:embed="rId73"/>
+                          <a:stretch>
+                            <a:fillRect/>
+                          </a:stretch>
+                        </pic:blipFill>
+                        <pic:spPr>
+                          <a:xfrm>
+                            <a:off x="0" y="0"/>
+                            <a:ext cx="2615184" cy="1898826"/>
+                          </a:xfrm>
+                          <a:prstGeom prst="rect"/>
+                        </pic:spPr>
+                      </pic:pic>
+                    </a:graphicData>
+                  </a:graphic>
+                </wp:inline>
+              </w:drawing>
+            </w:r>
+          </w:p>
+          <w:p>
+            <w:pPr>
+              <w:spacing w:before="0" w:after="40" w:line="240" w:lineRule="auto"/>
+              <w:jc w:val="center"/>
+            </w:pPr>
+            <w:r>
+              <w:rPr>
+                <w:rFonts w:ascii="Times New Roman" w:hAnsi="Times New Roman"/>
+                <w:b/>
+                <w:sz w:val="19"/>
+              </w:rPr>
+              <w:t>(d)</w:t>
+            </w:r>
+          </w:p>
+        </w:tc>
+      </w:tr>
+    </w:tbl>
     <w:p>
       <w:pPr>
         <w:pStyle w:val="afffc"/>
+        <w:keepNext w:val="0"/>
         <w:keepLines/>
         <w:widowControl w:val="0"/>
         <w:spacing w:before="20" w:after="20"/>
@@ -29793,99 +29912,167 @@
         <w:ind w:firstLine="420"/>
       </w:pPr>
     </w:p>
-    <w:p>
-      <w:pPr>
-        <w:keepNext/>
-        <w:keepLines/>
+    <w:tbl>
+      <w:tblPr>
+        <w:tblW w:type="dxa" w:w="9000"/>
         <w:jc w:val="center"/>
-      </w:pPr>
-      <w:r>
-        <w:rPr>
-          <w:noProof/>
-        </w:rPr>
-        <w:drawing>
-          <wp:inline distT="0" distB="0" distL="0" distR="0" wp14:anchorId="076B4CA6" wp14:editId="3A6840A4">
-            <wp:extent cx="2788920" cy="2122909"/>
-            <wp:effectExtent l="0" t="0" r="0" b="0"/>
-            <wp:docPr id="170737794" name="Figure 7(a)" descr="图7(a) 有效成功率"/>
-            <wp:cNvGraphicFramePr>
-              <a:graphicFrameLocks xmlns:a="http://schemas.openxmlformats.org/drawingml/2006/main" noChangeAspect="1"/>
-            </wp:cNvGraphicFramePr>
-            <a:graphic xmlns:a="http://schemas.openxmlformats.org/drawingml/2006/main">
-              <a:graphicData uri="http://schemas.openxmlformats.org/drawingml/2006/picture">
-                <pic:pic xmlns:pic="http://schemas.openxmlformats.org/drawingml/2006/picture">
-                  <pic:nvPicPr>
-                    <pic:cNvPr id="0" name="figure7_a.png"/>
-                    <pic:cNvPicPr/>
-                  </pic:nvPicPr>
-                  <pic:blipFill>
-                    <a:blip r:embed="rId24"/>
-                    <a:stretch>
-                      <a:fillRect/>
-                    </a:stretch>
-                  </pic:blipFill>
-                  <pic:spPr>
-                    <a:xfrm>
-                      <a:off x="0" y="0"/>
-                      <a:ext cx="2788920" cy="2122909"/>
-                    </a:xfrm>
-                    <a:prstGeom prst="rect">
-                      <a:avLst/>
-                    </a:prstGeom>
-                  </pic:spPr>
-                </pic:pic>
-              </a:graphicData>
-            </a:graphic>
-          </wp:inline>
-        </w:drawing>
-      </w:r>
-      <w:r>
-        <w:t xml:space="preserve"> </w:t>
-      </w:r>
-      <w:r>
-        <w:rPr>
-          <w:noProof/>
-        </w:rPr>
-        <w:drawing>
-          <wp:inline distT="0" distB="0" distL="0" distR="0" wp14:anchorId="4C84A03B" wp14:editId="1703CA4F">
-            <wp:extent cx="2788920" cy="2122909"/>
-            <wp:effectExtent l="0" t="0" r="0" b="0"/>
-            <wp:docPr id="170737795" name="Figure 7(b)" descr="图7(b) 归一化成功AUC"/>
-            <wp:cNvGraphicFramePr>
-              <a:graphicFrameLocks xmlns:a="http://schemas.openxmlformats.org/drawingml/2006/main" noChangeAspect="1"/>
-            </wp:cNvGraphicFramePr>
-            <a:graphic xmlns:a="http://schemas.openxmlformats.org/drawingml/2006/main">
-              <a:graphicData uri="http://schemas.openxmlformats.org/drawingml/2006/picture">
-                <pic:pic xmlns:pic="http://schemas.openxmlformats.org/drawingml/2006/picture">
-                  <pic:nvPicPr>
-                    <pic:cNvPr id="0" name="figure7_b.png"/>
-                    <pic:cNvPicPr/>
-                  </pic:nvPicPr>
-                  <pic:blipFill>
-                    <a:blip r:embed="rId25"/>
-                    <a:stretch>
-                      <a:fillRect/>
-                    </a:stretch>
-                  </pic:blipFill>
-                  <pic:spPr>
-                    <a:xfrm>
-                      <a:off x="0" y="0"/>
-                      <a:ext cx="2788920" cy="2122909"/>
-                    </a:xfrm>
-                    <a:prstGeom prst="rect">
-                      <a:avLst/>
-                    </a:prstGeom>
-                  </pic:spPr>
-                </pic:pic>
-              </a:graphicData>
-            </a:graphic>
-          </wp:inline>
-        </w:drawing>
-      </w:r>
-    </w:p>
+        <w:tblLayout w:type="fixed"/>
+        <w:tblLook w:firstColumn="1" w:firstRow="1" w:lastColumn="0" w:lastRow="0" w:noHBand="0" w:noVBand="1" w:val="04A0"/>
+        <w:tblBorders>
+          <w:top w:val="nil"/>
+          <w:left w:val="nil"/>
+          <w:bottom w:val="nil"/>
+          <w:right w:val="nil"/>
+          <w:insideH w:val="nil"/>
+          <w:insideV w:val="nil"/>
+        </w:tblBorders>
+      </w:tblPr>
+      <w:tblGrid>
+        <w:gridCol w:w="4500"/>
+        <w:gridCol w:w="4500"/>
+      </w:tblGrid>
+      <w:tr>
+        <w:trPr>
+          <w:cantSplit/>
+        </w:trPr>
+        <w:tc>
+          <w:tcPr>
+            <w:tcW w:type="dxa" w:w="4500"/>
+            <w:vAlign w:val="center"/>
+            <w:tcMar>
+              <w:top w:w="40" w:type="dxa"/>
+              <w:start w:w="40" w:type="dxa"/>
+              <w:bottom w:w="20" w:type="dxa"/>
+              <w:end w:w="40" w:type="dxa"/>
+            </w:tcMar>
+          </w:tcPr>
+          <w:p>
+            <w:pPr>
+              <w:spacing w:before="0" w:after="0" w:line="240" w:lineRule="auto"/>
+              <w:jc w:val="center"/>
+            </w:pPr>
+            <w:r>
+              <w:drawing>
+                <wp:inline xmlns:a="http://schemas.openxmlformats.org/drawingml/2006/main" xmlns:pic="http://schemas.openxmlformats.org/drawingml/2006/picture">
+                  <wp:extent cx="2615184" cy="1886148"/>
+                  <wp:docPr id="170737814" name="Figure 7(a)" descr="图7(a) 有效成功率"/>
+                  <wp:cNvGraphicFramePr>
+                    <a:graphicFrameLocks noChangeAspect="1"/>
+                  </wp:cNvGraphicFramePr>
+                  <a:graphic>
+                    <a:graphicData uri="http://schemas.openxmlformats.org/drawingml/2006/picture">
+                      <pic:pic>
+                        <pic:nvPicPr>
+                          <pic:cNvPr id="0" name="figure7_a.png"/>
+                          <pic:cNvPicPr/>
+                        </pic:nvPicPr>
+                        <pic:blipFill>
+                          <a:blip r:embed="rId74"/>
+                          <a:stretch>
+                            <a:fillRect/>
+                          </a:stretch>
+                        </pic:blipFill>
+                        <pic:spPr>
+                          <a:xfrm>
+                            <a:off x="0" y="0"/>
+                            <a:ext cx="2615184" cy="1886148"/>
+                          </a:xfrm>
+                          <a:prstGeom prst="rect"/>
+                        </pic:spPr>
+                      </pic:pic>
+                    </a:graphicData>
+                  </a:graphic>
+                </wp:inline>
+              </w:drawing>
+            </w:r>
+          </w:p>
+          <w:p>
+            <w:pPr>
+              <w:spacing w:before="0" w:after="40" w:line="240" w:lineRule="auto"/>
+              <w:jc w:val="center"/>
+            </w:pPr>
+            <w:r>
+              <w:rPr>
+                <w:rFonts w:ascii="Times New Roman" w:hAnsi="Times New Roman"/>
+                <w:b/>
+                <w:sz w:val="19"/>
+              </w:rPr>
+              <w:t>(a)</w:t>
+            </w:r>
+          </w:p>
+        </w:tc>
+        <w:tc>
+          <w:tcPr>
+            <w:tcW w:type="dxa" w:w="4500"/>
+            <w:vAlign w:val="center"/>
+            <w:tcMar>
+              <w:top w:w="40" w:type="dxa"/>
+              <w:start w:w="40" w:type="dxa"/>
+              <w:bottom w:w="20" w:type="dxa"/>
+              <w:end w:w="40" w:type="dxa"/>
+            </w:tcMar>
+          </w:tcPr>
+          <w:p>
+            <w:pPr>
+              <w:spacing w:before="0" w:after="0" w:line="240" w:lineRule="auto"/>
+              <w:jc w:val="center"/>
+            </w:pPr>
+            <w:r>
+              <w:drawing>
+                <wp:inline xmlns:a="http://schemas.openxmlformats.org/drawingml/2006/main" xmlns:pic="http://schemas.openxmlformats.org/drawingml/2006/picture">
+                  <wp:extent cx="2615184" cy="1886148"/>
+                  <wp:docPr id="170737815" name="Figure 7(b)" descr="图7(b) 归一化成功AUC"/>
+                  <wp:cNvGraphicFramePr>
+                    <a:graphicFrameLocks noChangeAspect="1"/>
+                  </wp:cNvGraphicFramePr>
+                  <a:graphic>
+                    <a:graphicData uri="http://schemas.openxmlformats.org/drawingml/2006/picture">
+                      <pic:pic>
+                        <pic:nvPicPr>
+                          <pic:cNvPr id="0" name="figure7_b.png"/>
+                          <pic:cNvPicPr/>
+                        </pic:nvPicPr>
+                        <pic:blipFill>
+                          <a:blip r:embed="rId75"/>
+                          <a:stretch>
+                            <a:fillRect/>
+                          </a:stretch>
+                        </pic:blipFill>
+                        <pic:spPr>
+                          <a:xfrm>
+                            <a:off x="0" y="0"/>
+                            <a:ext cx="2615184" cy="1886148"/>
+                          </a:xfrm>
+                          <a:prstGeom prst="rect"/>
+                        </pic:spPr>
+                      </pic:pic>
+                    </a:graphicData>
+                  </a:graphic>
+                </wp:inline>
+              </w:drawing>
+            </w:r>
+          </w:p>
+          <w:p>
+            <w:pPr>
+              <w:spacing w:before="0" w:after="40" w:line="240" w:lineRule="auto"/>
+              <w:jc w:val="center"/>
+            </w:pPr>
+            <w:r>
+              <w:rPr>
+                <w:rFonts w:ascii="Times New Roman" w:hAnsi="Times New Roman"/>
+                <w:b/>
+                <w:sz w:val="19"/>
+              </w:rPr>
+              <w:t>(b)</w:t>
+            </w:r>
+          </w:p>
+        </w:tc>
+      </w:tr>
+    </w:tbl>
     <w:p>
       <w:pPr>
         <w:pStyle w:val="afffc"/>
+        <w:keepNext w:val="0"/>
         <w:keepLines/>
         <w:widowControl w:val="0"/>
         <w:spacing w:before="20" w:after="20"/>
@@ -30795,189 +30982,304 @@
         <w:ind w:firstLine="420"/>
       </w:pPr>
     </w:p>
-    <w:p>
-      <w:pPr>
-        <w:keepNext/>
-        <w:keepLines/>
+    <w:tbl>
+      <w:tblPr>
+        <w:tblW w:type="dxa" w:w="9000"/>
         <w:jc w:val="center"/>
-      </w:pPr>
-      <w:r>
-        <w:rPr>
-          <w:noProof/>
-        </w:rPr>
-        <w:drawing>
-          <wp:inline distT="0" distB="0" distL="0" distR="0" wp14:anchorId="0774E822" wp14:editId="2AFA1301">
-            <wp:extent cx="2788920" cy="1811131"/>
-            <wp:effectExtent l="0" t="0" r="0" b="0"/>
-            <wp:docPr id="170737796" name="Figure 8(a)" descr="图8(a) 共识成功率"/>
-            <wp:cNvGraphicFramePr>
-              <a:graphicFrameLocks xmlns:a="http://schemas.openxmlformats.org/drawingml/2006/main" noChangeAspect="1"/>
-            </wp:cNvGraphicFramePr>
-            <a:graphic xmlns:a="http://schemas.openxmlformats.org/drawingml/2006/main">
-              <a:graphicData uri="http://schemas.openxmlformats.org/drawingml/2006/picture">
-                <pic:pic xmlns:pic="http://schemas.openxmlformats.org/drawingml/2006/picture">
-                  <pic:nvPicPr>
-                    <pic:cNvPr id="0" name="figure8_a.png"/>
-                    <pic:cNvPicPr/>
-                  </pic:nvPicPr>
-                  <pic:blipFill>
-                    <a:blip r:embed="rId26"/>
-                    <a:stretch>
-                      <a:fillRect/>
-                    </a:stretch>
-                  </pic:blipFill>
-                  <pic:spPr>
-                    <a:xfrm>
-                      <a:off x="0" y="0"/>
-                      <a:ext cx="2788920" cy="1811131"/>
-                    </a:xfrm>
-                    <a:prstGeom prst="rect">
-                      <a:avLst/>
-                    </a:prstGeom>
-                  </pic:spPr>
-                </pic:pic>
-              </a:graphicData>
-            </a:graphic>
-          </wp:inline>
-        </w:drawing>
-      </w:r>
-      <w:r>
-        <w:t xml:space="preserve"> </w:t>
-      </w:r>
-      <w:r>
-        <w:rPr>
-          <w:noProof/>
-        </w:rPr>
-        <w:drawing>
-          <wp:inline distT="0" distB="0" distL="0" distR="0" wp14:anchorId="56B7DF1C" wp14:editId="66F71587">
-            <wp:extent cx="2788920" cy="1811131"/>
-            <wp:effectExtent l="0" t="0" r="0" b="0"/>
-            <wp:docPr id="170737797" name="Figure 8(b)" descr="图8(b) 平均收敛步数"/>
-            <wp:cNvGraphicFramePr>
-              <a:graphicFrameLocks xmlns:a="http://schemas.openxmlformats.org/drawingml/2006/main" noChangeAspect="1"/>
-            </wp:cNvGraphicFramePr>
-            <a:graphic xmlns:a="http://schemas.openxmlformats.org/drawingml/2006/main">
-              <a:graphicData uri="http://schemas.openxmlformats.org/drawingml/2006/picture">
-                <pic:pic xmlns:pic="http://schemas.openxmlformats.org/drawingml/2006/picture">
-                  <pic:nvPicPr>
-                    <pic:cNvPr id="0" name="figure8_b.png"/>
-                    <pic:cNvPicPr/>
-                  </pic:nvPicPr>
-                  <pic:blipFill>
-                    <a:blip r:embed="rId27"/>
-                    <a:stretch>
-                      <a:fillRect/>
-                    </a:stretch>
-                  </pic:blipFill>
-                  <pic:spPr>
-                    <a:xfrm>
-                      <a:off x="0" y="0"/>
-                      <a:ext cx="2788920" cy="1811131"/>
-                    </a:xfrm>
-                    <a:prstGeom prst="rect">
-                      <a:avLst/>
-                    </a:prstGeom>
-                  </pic:spPr>
-                </pic:pic>
-              </a:graphicData>
-            </a:graphic>
-          </wp:inline>
-        </w:drawing>
-      </w:r>
-    </w:p>
-    <w:p>
-      <w:pPr>
-        <w:keepNext/>
-        <w:keepLines/>
-        <w:jc w:val="center"/>
-      </w:pPr>
-      <w:r>
-        <w:rPr>
-          <w:noProof/>
-        </w:rPr>
-        <w:drawing>
-          <wp:inline distT="0" distB="0" distL="0" distR="0" wp14:anchorId="3001CC83" wp14:editId="500F89B7">
-            <wp:extent cx="2788920" cy="1812719"/>
-            <wp:effectExtent l="0" t="0" r="0" b="0"/>
-            <wp:docPr id="170737798" name="Figure 8(c)" descr="图8(c) 平均回合奖励"/>
-            <wp:cNvGraphicFramePr>
-              <a:graphicFrameLocks xmlns:a="http://schemas.openxmlformats.org/drawingml/2006/main" noChangeAspect="1"/>
-            </wp:cNvGraphicFramePr>
-            <a:graphic xmlns:a="http://schemas.openxmlformats.org/drawingml/2006/main">
-              <a:graphicData uri="http://schemas.openxmlformats.org/drawingml/2006/picture">
-                <pic:pic xmlns:pic="http://schemas.openxmlformats.org/drawingml/2006/picture">
-                  <pic:nvPicPr>
-                    <pic:cNvPr id="0" name="figure8_c.png"/>
-                    <pic:cNvPicPr/>
-                  </pic:nvPicPr>
-                  <pic:blipFill>
-                    <a:blip r:embed="rId28"/>
-                    <a:stretch>
-                      <a:fillRect/>
-                    </a:stretch>
-                  </pic:blipFill>
-                  <pic:spPr>
-                    <a:xfrm>
-                      <a:off x="0" y="0"/>
-                      <a:ext cx="2788920" cy="1812719"/>
-                    </a:xfrm>
-                    <a:prstGeom prst="rect">
-                      <a:avLst/>
-                    </a:prstGeom>
-                  </pic:spPr>
-                </pic:pic>
-              </a:graphicData>
-            </a:graphic>
-          </wp:inline>
-        </w:drawing>
-      </w:r>
-      <w:r>
-        <w:t xml:space="preserve"> </w:t>
-      </w:r>
-      <w:r>
-        <w:rPr>
-          <w:noProof/>
-        </w:rPr>
-        <w:drawing>
-          <wp:inline distT="0" distB="0" distL="0" distR="0" wp14:anchorId="7F23204C" wp14:editId="019AF641">
-            <wp:extent cx="2788920" cy="1812719"/>
-            <wp:effectExtent l="0" t="0" r="0" b="0"/>
-            <wp:docPr id="170737799" name="Figure 8(d)" descr="图8(d) 平均总调整成本"/>
-            <wp:cNvGraphicFramePr>
-              <a:graphicFrameLocks xmlns:a="http://schemas.openxmlformats.org/drawingml/2006/main" noChangeAspect="1"/>
-            </wp:cNvGraphicFramePr>
-            <a:graphic xmlns:a="http://schemas.openxmlformats.org/drawingml/2006/main">
-              <a:graphicData uri="http://schemas.openxmlformats.org/drawingml/2006/picture">
-                <pic:pic xmlns:pic="http://schemas.openxmlformats.org/drawingml/2006/picture">
-                  <pic:nvPicPr>
-                    <pic:cNvPr id="0" name="figure8_d.png"/>
-                    <pic:cNvPicPr/>
-                  </pic:nvPicPr>
-                  <pic:blipFill>
-                    <a:blip r:embed="rId29"/>
-                    <a:stretch>
-                      <a:fillRect/>
-                    </a:stretch>
-                  </pic:blipFill>
-                  <pic:spPr>
-                    <a:xfrm>
-                      <a:off x="0" y="0"/>
-                      <a:ext cx="2788920" cy="1812719"/>
-                    </a:xfrm>
-                    <a:prstGeom prst="rect">
-                      <a:avLst/>
-                    </a:prstGeom>
-                  </pic:spPr>
-                </pic:pic>
-              </a:graphicData>
-            </a:graphic>
-          </wp:inline>
-        </w:drawing>
-      </w:r>
-    </w:p>
+        <w:tblLayout w:type="fixed"/>
+        <w:tblLook w:firstColumn="1" w:firstRow="1" w:lastColumn="0" w:lastRow="0" w:noHBand="0" w:noVBand="1" w:val="04A0"/>
+        <w:tblBorders>
+          <w:top w:val="nil"/>
+          <w:left w:val="nil"/>
+          <w:bottom w:val="nil"/>
+          <w:right w:val="nil"/>
+          <w:insideH w:val="nil"/>
+          <w:insideV w:val="nil"/>
+        </w:tblBorders>
+      </w:tblPr>
+      <w:tblGrid>
+        <w:gridCol w:w="4500"/>
+        <w:gridCol w:w="4500"/>
+      </w:tblGrid>
+      <w:tr>
+        <w:trPr>
+          <w:cantSplit/>
+        </w:trPr>
+        <w:tc>
+          <w:tcPr>
+            <w:tcW w:type="dxa" w:w="4500"/>
+            <w:vAlign w:val="center"/>
+            <w:tcMar>
+              <w:top w:w="40" w:type="dxa"/>
+              <w:start w:w="40" w:type="dxa"/>
+              <w:bottom w:w="20" w:type="dxa"/>
+              <w:end w:w="40" w:type="dxa"/>
+            </w:tcMar>
+          </w:tcPr>
+          <w:p>
+            <w:pPr>
+              <w:spacing w:before="0" w:after="0" w:line="240" w:lineRule="auto"/>
+              <w:jc w:val="center"/>
+            </w:pPr>
+            <w:r>
+              <w:drawing>
+                <wp:inline xmlns:a="http://schemas.openxmlformats.org/drawingml/2006/main" xmlns:pic="http://schemas.openxmlformats.org/drawingml/2006/picture">
+                  <wp:extent cx="2615184" cy="1914188"/>
+                  <wp:docPr id="170737816" name="Figure 8(a)" descr="图8(a) 共识成功率"/>
+                  <wp:cNvGraphicFramePr>
+                    <a:graphicFrameLocks noChangeAspect="1"/>
+                  </wp:cNvGraphicFramePr>
+                  <a:graphic>
+                    <a:graphicData uri="http://schemas.openxmlformats.org/drawingml/2006/picture">
+                      <pic:pic>
+                        <pic:nvPicPr>
+                          <pic:cNvPr id="0" name="figure8_a.png"/>
+                          <pic:cNvPicPr/>
+                        </pic:nvPicPr>
+                        <pic:blipFill>
+                          <a:blip r:embed="rId76"/>
+                          <a:stretch>
+                            <a:fillRect/>
+                          </a:stretch>
+                        </pic:blipFill>
+                        <pic:spPr>
+                          <a:xfrm>
+                            <a:off x="0" y="0"/>
+                            <a:ext cx="2615184" cy="1914188"/>
+                          </a:xfrm>
+                          <a:prstGeom prst="rect"/>
+                        </pic:spPr>
+                      </pic:pic>
+                    </a:graphicData>
+                  </a:graphic>
+                </wp:inline>
+              </w:drawing>
+            </w:r>
+          </w:p>
+          <w:p>
+            <w:pPr>
+              <w:spacing w:before="0" w:after="40" w:line="240" w:lineRule="auto"/>
+              <w:jc w:val="center"/>
+            </w:pPr>
+            <w:r>
+              <w:rPr>
+                <w:rFonts w:ascii="Times New Roman" w:hAnsi="Times New Roman"/>
+                <w:b/>
+                <w:sz w:val="19"/>
+              </w:rPr>
+              <w:t>(a)</w:t>
+            </w:r>
+          </w:p>
+        </w:tc>
+        <w:tc>
+          <w:tcPr>
+            <w:tcW w:type="dxa" w:w="4500"/>
+            <w:vAlign w:val="center"/>
+            <w:tcMar>
+              <w:top w:w="40" w:type="dxa"/>
+              <w:start w:w="40" w:type="dxa"/>
+              <w:bottom w:w="20" w:type="dxa"/>
+              <w:end w:w="40" w:type="dxa"/>
+            </w:tcMar>
+          </w:tcPr>
+          <w:p>
+            <w:pPr>
+              <w:spacing w:before="0" w:after="0" w:line="240" w:lineRule="auto"/>
+              <w:jc w:val="center"/>
+            </w:pPr>
+            <w:r>
+              <w:drawing>
+                <wp:inline xmlns:a="http://schemas.openxmlformats.org/drawingml/2006/main" xmlns:pic="http://schemas.openxmlformats.org/drawingml/2006/picture">
+                  <wp:extent cx="2615184" cy="1914188"/>
+                  <wp:docPr id="170737817" name="Figure 8(b)" descr="图8(b) 平均收敛步数"/>
+                  <wp:cNvGraphicFramePr>
+                    <a:graphicFrameLocks noChangeAspect="1"/>
+                  </wp:cNvGraphicFramePr>
+                  <a:graphic>
+                    <a:graphicData uri="http://schemas.openxmlformats.org/drawingml/2006/picture">
+                      <pic:pic>
+                        <pic:nvPicPr>
+                          <pic:cNvPr id="0" name="figure8_b.png"/>
+                          <pic:cNvPicPr/>
+                        </pic:nvPicPr>
+                        <pic:blipFill>
+                          <a:blip r:embed="rId77"/>
+                          <a:stretch>
+                            <a:fillRect/>
+                          </a:stretch>
+                        </pic:blipFill>
+                        <pic:spPr>
+                          <a:xfrm>
+                            <a:off x="0" y="0"/>
+                            <a:ext cx="2615184" cy="1914188"/>
+                          </a:xfrm>
+                          <a:prstGeom prst="rect"/>
+                        </pic:spPr>
+                      </pic:pic>
+                    </a:graphicData>
+                  </a:graphic>
+                </wp:inline>
+              </w:drawing>
+            </w:r>
+          </w:p>
+          <w:p>
+            <w:pPr>
+              <w:spacing w:before="0" w:after="40" w:line="240" w:lineRule="auto"/>
+              <w:jc w:val="center"/>
+            </w:pPr>
+            <w:r>
+              <w:rPr>
+                <w:rFonts w:ascii="Times New Roman" w:hAnsi="Times New Roman"/>
+                <w:b/>
+                <w:sz w:val="19"/>
+              </w:rPr>
+              <w:t>(b)</w:t>
+            </w:r>
+          </w:p>
+        </w:tc>
+      </w:tr>
+      <w:tr>
+        <w:trPr>
+          <w:cantSplit/>
+        </w:trPr>
+        <w:tc>
+          <w:tcPr>
+            <w:tcW w:type="dxa" w:w="4500"/>
+            <w:vAlign w:val="center"/>
+            <w:tcMar>
+              <w:top w:w="40" w:type="dxa"/>
+              <w:start w:w="40" w:type="dxa"/>
+              <w:bottom w:w="20" w:type="dxa"/>
+              <w:end w:w="40" w:type="dxa"/>
+            </w:tcMar>
+          </w:tcPr>
+          <w:p>
+            <w:pPr>
+              <w:spacing w:before="0" w:after="0" w:line="240" w:lineRule="auto"/>
+              <w:jc w:val="center"/>
+            </w:pPr>
+            <w:r>
+              <w:drawing>
+                <wp:inline xmlns:a="http://schemas.openxmlformats.org/drawingml/2006/main" xmlns:pic="http://schemas.openxmlformats.org/drawingml/2006/picture">
+                  <wp:extent cx="2615184" cy="1914188"/>
+                  <wp:docPr id="170737818" name="Figure 8(c)" descr="图8(c) 平均回合奖励"/>
+                  <wp:cNvGraphicFramePr>
+                    <a:graphicFrameLocks noChangeAspect="1"/>
+                  </wp:cNvGraphicFramePr>
+                  <a:graphic>
+                    <a:graphicData uri="http://schemas.openxmlformats.org/drawingml/2006/picture">
+                      <pic:pic>
+                        <pic:nvPicPr>
+                          <pic:cNvPr id="0" name="figure8_c.png"/>
+                          <pic:cNvPicPr/>
+                        </pic:nvPicPr>
+                        <pic:blipFill>
+                          <a:blip r:embed="rId78"/>
+                          <a:stretch>
+                            <a:fillRect/>
+                          </a:stretch>
+                        </pic:blipFill>
+                        <pic:spPr>
+                          <a:xfrm>
+                            <a:off x="0" y="0"/>
+                            <a:ext cx="2615184" cy="1914188"/>
+                          </a:xfrm>
+                          <a:prstGeom prst="rect"/>
+                        </pic:spPr>
+                      </pic:pic>
+                    </a:graphicData>
+                  </a:graphic>
+                </wp:inline>
+              </w:drawing>
+            </w:r>
+          </w:p>
+          <w:p>
+            <w:pPr>
+              <w:spacing w:before="0" w:after="40" w:line="240" w:lineRule="auto"/>
+              <w:jc w:val="center"/>
+            </w:pPr>
+            <w:r>
+              <w:rPr>
+                <w:rFonts w:ascii="Times New Roman" w:hAnsi="Times New Roman"/>
+                <w:b/>
+                <w:sz w:val="19"/>
+              </w:rPr>
+              <w:t>(c)</w:t>
+            </w:r>
+          </w:p>
+        </w:tc>
+        <w:tc>
+          <w:tcPr>
+            <w:tcW w:type="dxa" w:w="4500"/>
+            <w:vAlign w:val="center"/>
+            <w:tcMar>
+              <w:top w:w="40" w:type="dxa"/>
+              <w:start w:w="40" w:type="dxa"/>
+              <w:bottom w:w="20" w:type="dxa"/>
+              <w:end w:w="40" w:type="dxa"/>
+            </w:tcMar>
+          </w:tcPr>
+          <w:p>
+            <w:pPr>
+              <w:spacing w:before="0" w:after="0" w:line="240" w:lineRule="auto"/>
+              <w:jc w:val="center"/>
+            </w:pPr>
+            <w:r>
+              <w:drawing>
+                <wp:inline xmlns:a="http://schemas.openxmlformats.org/drawingml/2006/main" xmlns:pic="http://schemas.openxmlformats.org/drawingml/2006/picture">
+                  <wp:extent cx="2615184" cy="1914188"/>
+                  <wp:docPr id="170737819" name="Figure 8(d)" descr="图8(d) 平均总调整成本"/>
+                  <wp:cNvGraphicFramePr>
+                    <a:graphicFrameLocks noChangeAspect="1"/>
+                  </wp:cNvGraphicFramePr>
+                  <a:graphic>
+                    <a:graphicData uri="http://schemas.openxmlformats.org/drawingml/2006/picture">
+                      <pic:pic>
+                        <pic:nvPicPr>
+                          <pic:cNvPr id="0" name="figure8_d.png"/>
+                          <pic:cNvPicPr/>
+                        </pic:nvPicPr>
+                        <pic:blipFill>
+                          <a:blip r:embed="rId79"/>
+                          <a:stretch>
+                            <a:fillRect/>
+                          </a:stretch>
+                        </pic:blipFill>
+                        <pic:spPr>
+                          <a:xfrm>
+                            <a:off x="0" y="0"/>
+                            <a:ext cx="2615184" cy="1914188"/>
+                          </a:xfrm>
+                          <a:prstGeom prst="rect"/>
+                        </pic:spPr>
+                      </pic:pic>
+                    </a:graphicData>
+                  </a:graphic>
+                </wp:inline>
+              </w:drawing>
+            </w:r>
+          </w:p>
+          <w:p>
+            <w:pPr>
+              <w:spacing w:before="0" w:after="40" w:line="240" w:lineRule="auto"/>
+              <w:jc w:val="center"/>
+            </w:pPr>
+            <w:r>
+              <w:rPr>
+                <w:rFonts w:ascii="Times New Roman" w:hAnsi="Times New Roman"/>
+                <w:b/>
+                <w:sz w:val="19"/>
+              </w:rPr>
+              <w:t>(d)</w:t>
+            </w:r>
+          </w:p>
+        </w:tc>
+      </w:tr>
+    </w:tbl>
     <w:p>
       <w:pPr>
         <w:pStyle w:val="afffc"/>
+        <w:keepNext w:val="0"/>
         <w:keepLines/>
         <w:widowControl w:val="0"/>
         <w:spacing w:before="20" w:after="20"/>
@@ -32016,189 +32318,304 @@
         <w:ind w:firstLine="420"/>
       </w:pPr>
     </w:p>
-    <w:p>
-      <w:pPr>
-        <w:keepNext/>
-        <w:keepLines/>
+    <w:tbl>
+      <w:tblPr>
+        <w:tblW w:type="dxa" w:w="9000"/>
         <w:jc w:val="center"/>
-      </w:pPr>
-      <w:r>
-        <w:rPr>
-          <w:noProof/>
-        </w:rPr>
-        <w:drawing>
-          <wp:inline distT="0" distB="0" distL="0" distR="0" wp14:anchorId="30E5CBCB" wp14:editId="7AC7FCB7">
-            <wp:extent cx="2788920" cy="1811131"/>
-            <wp:effectExtent l="0" t="0" r="0" b="0"/>
-            <wp:docPr id="170737800" name="Figure 9(a)" descr="图9(a) 共识成功率"/>
-            <wp:cNvGraphicFramePr>
-              <a:graphicFrameLocks xmlns:a="http://schemas.openxmlformats.org/drawingml/2006/main" noChangeAspect="1"/>
-            </wp:cNvGraphicFramePr>
-            <a:graphic xmlns:a="http://schemas.openxmlformats.org/drawingml/2006/main">
-              <a:graphicData uri="http://schemas.openxmlformats.org/drawingml/2006/picture">
-                <pic:pic xmlns:pic="http://schemas.openxmlformats.org/drawingml/2006/picture">
-                  <pic:nvPicPr>
-                    <pic:cNvPr id="0" name="figure9_a.png"/>
-                    <pic:cNvPicPr/>
-                  </pic:nvPicPr>
-                  <pic:blipFill>
-                    <a:blip r:embed="rId30"/>
-                    <a:stretch>
-                      <a:fillRect/>
-                    </a:stretch>
-                  </pic:blipFill>
-                  <pic:spPr>
-                    <a:xfrm>
-                      <a:off x="0" y="0"/>
-                      <a:ext cx="2788920" cy="1811131"/>
-                    </a:xfrm>
-                    <a:prstGeom prst="rect">
-                      <a:avLst/>
-                    </a:prstGeom>
-                  </pic:spPr>
-                </pic:pic>
-              </a:graphicData>
-            </a:graphic>
-          </wp:inline>
-        </w:drawing>
-      </w:r>
-      <w:r>
-        <w:t xml:space="preserve"> </w:t>
-      </w:r>
-      <w:r>
-        <w:rPr>
-          <w:noProof/>
-        </w:rPr>
-        <w:drawing>
-          <wp:inline distT="0" distB="0" distL="0" distR="0" wp14:anchorId="6536F93E" wp14:editId="0904B264">
-            <wp:extent cx="2788920" cy="1811131"/>
-            <wp:effectExtent l="0" t="0" r="0" b="0"/>
-            <wp:docPr id="170737801" name="Figure 9(b)" descr="图9(b) 平均收敛步数"/>
-            <wp:cNvGraphicFramePr>
-              <a:graphicFrameLocks xmlns:a="http://schemas.openxmlformats.org/drawingml/2006/main" noChangeAspect="1"/>
-            </wp:cNvGraphicFramePr>
-            <a:graphic xmlns:a="http://schemas.openxmlformats.org/drawingml/2006/main">
-              <a:graphicData uri="http://schemas.openxmlformats.org/drawingml/2006/picture">
-                <pic:pic xmlns:pic="http://schemas.openxmlformats.org/drawingml/2006/picture">
-                  <pic:nvPicPr>
-                    <pic:cNvPr id="0" name="figure9_b.png"/>
-                    <pic:cNvPicPr/>
-                  </pic:nvPicPr>
-                  <pic:blipFill>
-                    <a:blip r:embed="rId31"/>
-                    <a:stretch>
-                      <a:fillRect/>
-                    </a:stretch>
-                  </pic:blipFill>
-                  <pic:spPr>
-                    <a:xfrm>
-                      <a:off x="0" y="0"/>
-                      <a:ext cx="2788920" cy="1811131"/>
-                    </a:xfrm>
-                    <a:prstGeom prst="rect">
-                      <a:avLst/>
-                    </a:prstGeom>
-                  </pic:spPr>
-                </pic:pic>
-              </a:graphicData>
-            </a:graphic>
-          </wp:inline>
-        </w:drawing>
-      </w:r>
-    </w:p>
-    <w:p>
-      <w:pPr>
-        <w:keepNext/>
-        <w:keepLines/>
-        <w:jc w:val="center"/>
-      </w:pPr>
-      <w:r>
-        <w:rPr>
-          <w:noProof/>
-        </w:rPr>
-        <w:drawing>
-          <wp:inline distT="0" distB="0" distL="0" distR="0" wp14:anchorId="143C6B44" wp14:editId="6CEBC75F">
-            <wp:extent cx="2788920" cy="1812719"/>
-            <wp:effectExtent l="0" t="0" r="0" b="0"/>
-            <wp:docPr id="170737802" name="Figure 9(c)" descr="图9(c) 平均总调整成本"/>
-            <wp:cNvGraphicFramePr>
-              <a:graphicFrameLocks xmlns:a="http://schemas.openxmlformats.org/drawingml/2006/main" noChangeAspect="1"/>
-            </wp:cNvGraphicFramePr>
-            <a:graphic xmlns:a="http://schemas.openxmlformats.org/drawingml/2006/main">
-              <a:graphicData uri="http://schemas.openxmlformats.org/drawingml/2006/picture">
-                <pic:pic xmlns:pic="http://schemas.openxmlformats.org/drawingml/2006/picture">
-                  <pic:nvPicPr>
-                    <pic:cNvPr id="0" name="figure9_c.png"/>
-                    <pic:cNvPicPr/>
-                  </pic:nvPicPr>
-                  <pic:blipFill>
-                    <a:blip r:embed="rId32"/>
-                    <a:stretch>
-                      <a:fillRect/>
-                    </a:stretch>
-                  </pic:blipFill>
-                  <pic:spPr>
-                    <a:xfrm>
-                      <a:off x="0" y="0"/>
-                      <a:ext cx="2788920" cy="1812719"/>
-                    </a:xfrm>
-                    <a:prstGeom prst="rect">
-                      <a:avLst/>
-                    </a:prstGeom>
-                  </pic:spPr>
-                </pic:pic>
-              </a:graphicData>
-            </a:graphic>
-          </wp:inline>
-        </w:drawing>
-      </w:r>
-      <w:r>
-        <w:t xml:space="preserve"> </w:t>
-      </w:r>
-      <w:r>
-        <w:rPr>
-          <w:noProof/>
-        </w:rPr>
-        <w:drawing>
-          <wp:inline distT="0" distB="0" distL="0" distR="0" wp14:anchorId="2C4C8624" wp14:editId="0EC2EC05">
-            <wp:extent cx="2788920" cy="1812719"/>
-            <wp:effectExtent l="0" t="0" r="0" b="0"/>
-            <wp:docPr id="170737803" name="Figure 9(d)" descr="图9(d) 平均回合奖励"/>
-            <wp:cNvGraphicFramePr>
-              <a:graphicFrameLocks xmlns:a="http://schemas.openxmlformats.org/drawingml/2006/main" noChangeAspect="1"/>
-            </wp:cNvGraphicFramePr>
-            <a:graphic xmlns:a="http://schemas.openxmlformats.org/drawingml/2006/main">
-              <a:graphicData uri="http://schemas.openxmlformats.org/drawingml/2006/picture">
-                <pic:pic xmlns:pic="http://schemas.openxmlformats.org/drawingml/2006/picture">
-                  <pic:nvPicPr>
-                    <pic:cNvPr id="0" name="figure9_d.png"/>
-                    <pic:cNvPicPr/>
-                  </pic:nvPicPr>
-                  <pic:blipFill>
-                    <a:blip r:embed="rId33"/>
-                    <a:stretch>
-                      <a:fillRect/>
-                    </a:stretch>
-                  </pic:blipFill>
-                  <pic:spPr>
-                    <a:xfrm>
-                      <a:off x="0" y="0"/>
-                      <a:ext cx="2788920" cy="1812719"/>
-                    </a:xfrm>
-                    <a:prstGeom prst="rect">
-                      <a:avLst/>
-                    </a:prstGeom>
-                  </pic:spPr>
-                </pic:pic>
-              </a:graphicData>
-            </a:graphic>
-          </wp:inline>
-        </w:drawing>
-      </w:r>
-    </w:p>
+        <w:tblLayout w:type="fixed"/>
+        <w:tblLook w:firstColumn="1" w:firstRow="1" w:lastColumn="0" w:lastRow="0" w:noHBand="0" w:noVBand="1" w:val="04A0"/>
+        <w:tblBorders>
+          <w:top w:val="nil"/>
+          <w:left w:val="nil"/>
+          <w:bottom w:val="nil"/>
+          <w:right w:val="nil"/>
+          <w:insideH w:val="nil"/>
+          <w:insideV w:val="nil"/>
+        </w:tblBorders>
+      </w:tblPr>
+      <w:tblGrid>
+        <w:gridCol w:w="4500"/>
+        <w:gridCol w:w="4500"/>
+      </w:tblGrid>
+      <w:tr>
+        <w:trPr>
+          <w:cantSplit/>
+        </w:trPr>
+        <w:tc>
+          <w:tcPr>
+            <w:tcW w:type="dxa" w:w="4500"/>
+            <w:vAlign w:val="center"/>
+            <w:tcMar>
+              <w:top w:w="40" w:type="dxa"/>
+              <w:start w:w="40" w:type="dxa"/>
+              <w:bottom w:w="20" w:type="dxa"/>
+              <w:end w:w="40" w:type="dxa"/>
+            </w:tcMar>
+          </w:tcPr>
+          <w:p>
+            <w:pPr>
+              <w:spacing w:before="0" w:after="0" w:line="240" w:lineRule="auto"/>
+              <w:jc w:val="center"/>
+            </w:pPr>
+            <w:r>
+              <w:drawing>
+                <wp:inline xmlns:a="http://schemas.openxmlformats.org/drawingml/2006/main" xmlns:pic="http://schemas.openxmlformats.org/drawingml/2006/picture">
+                  <wp:extent cx="2615184" cy="1898826"/>
+                  <wp:docPr id="170737820" name="Figure 9(a)" descr="图9(a) 共识成功率"/>
+                  <wp:cNvGraphicFramePr>
+                    <a:graphicFrameLocks noChangeAspect="1"/>
+                  </wp:cNvGraphicFramePr>
+                  <a:graphic>
+                    <a:graphicData uri="http://schemas.openxmlformats.org/drawingml/2006/picture">
+                      <pic:pic>
+                        <pic:nvPicPr>
+                          <pic:cNvPr id="0" name="figure9_a.png"/>
+                          <pic:cNvPicPr/>
+                        </pic:nvPicPr>
+                        <pic:blipFill>
+                          <a:blip r:embed="rId80"/>
+                          <a:stretch>
+                            <a:fillRect/>
+                          </a:stretch>
+                        </pic:blipFill>
+                        <pic:spPr>
+                          <a:xfrm>
+                            <a:off x="0" y="0"/>
+                            <a:ext cx="2615184" cy="1898826"/>
+                          </a:xfrm>
+                          <a:prstGeom prst="rect"/>
+                        </pic:spPr>
+                      </pic:pic>
+                    </a:graphicData>
+                  </a:graphic>
+                </wp:inline>
+              </w:drawing>
+            </w:r>
+          </w:p>
+          <w:p>
+            <w:pPr>
+              <w:spacing w:before="0" w:after="40" w:line="240" w:lineRule="auto"/>
+              <w:jc w:val="center"/>
+            </w:pPr>
+            <w:r>
+              <w:rPr>
+                <w:rFonts w:ascii="Times New Roman" w:hAnsi="Times New Roman"/>
+                <w:b/>
+                <w:sz w:val="19"/>
+              </w:rPr>
+              <w:t>(a)</w:t>
+            </w:r>
+          </w:p>
+        </w:tc>
+        <w:tc>
+          <w:tcPr>
+            <w:tcW w:type="dxa" w:w="4500"/>
+            <w:vAlign w:val="center"/>
+            <w:tcMar>
+              <w:top w:w="40" w:type="dxa"/>
+              <w:start w:w="40" w:type="dxa"/>
+              <w:bottom w:w="20" w:type="dxa"/>
+              <w:end w:w="40" w:type="dxa"/>
+            </w:tcMar>
+          </w:tcPr>
+          <w:p>
+            <w:pPr>
+              <w:spacing w:before="0" w:after="0" w:line="240" w:lineRule="auto"/>
+              <w:jc w:val="center"/>
+            </w:pPr>
+            <w:r>
+              <w:drawing>
+                <wp:inline xmlns:a="http://schemas.openxmlformats.org/drawingml/2006/main" xmlns:pic="http://schemas.openxmlformats.org/drawingml/2006/picture">
+                  <wp:extent cx="2615184" cy="1898826"/>
+                  <wp:docPr id="170737821" name="Figure 9(b)" descr="图9(b) 平均收敛步数"/>
+                  <wp:cNvGraphicFramePr>
+                    <a:graphicFrameLocks noChangeAspect="1"/>
+                  </wp:cNvGraphicFramePr>
+                  <a:graphic>
+                    <a:graphicData uri="http://schemas.openxmlformats.org/drawingml/2006/picture">
+                      <pic:pic>
+                        <pic:nvPicPr>
+                          <pic:cNvPr id="0" name="figure9_b.png"/>
+                          <pic:cNvPicPr/>
+                        </pic:nvPicPr>
+                        <pic:blipFill>
+                          <a:blip r:embed="rId81"/>
+                          <a:stretch>
+                            <a:fillRect/>
+                          </a:stretch>
+                        </pic:blipFill>
+                        <pic:spPr>
+                          <a:xfrm>
+                            <a:off x="0" y="0"/>
+                            <a:ext cx="2615184" cy="1898826"/>
+                          </a:xfrm>
+                          <a:prstGeom prst="rect"/>
+                        </pic:spPr>
+                      </pic:pic>
+                    </a:graphicData>
+                  </a:graphic>
+                </wp:inline>
+              </w:drawing>
+            </w:r>
+          </w:p>
+          <w:p>
+            <w:pPr>
+              <w:spacing w:before="0" w:after="40" w:line="240" w:lineRule="auto"/>
+              <w:jc w:val="center"/>
+            </w:pPr>
+            <w:r>
+              <w:rPr>
+                <w:rFonts w:ascii="Times New Roman" w:hAnsi="Times New Roman"/>
+                <w:b/>
+                <w:sz w:val="19"/>
+              </w:rPr>
+              <w:t>(b)</w:t>
+            </w:r>
+          </w:p>
+        </w:tc>
+      </w:tr>
+      <w:tr>
+        <w:trPr>
+          <w:cantSplit/>
+        </w:trPr>
+        <w:tc>
+          <w:tcPr>
+            <w:tcW w:type="dxa" w:w="4500"/>
+            <w:vAlign w:val="center"/>
+            <w:tcMar>
+              <w:top w:w="40" w:type="dxa"/>
+              <w:start w:w="40" w:type="dxa"/>
+              <w:bottom w:w="20" w:type="dxa"/>
+              <w:end w:w="40" w:type="dxa"/>
+            </w:tcMar>
+          </w:tcPr>
+          <w:p>
+            <w:pPr>
+              <w:spacing w:before="0" w:after="0" w:line="240" w:lineRule="auto"/>
+              <w:jc w:val="center"/>
+            </w:pPr>
+            <w:r>
+              <w:drawing>
+                <wp:inline xmlns:a="http://schemas.openxmlformats.org/drawingml/2006/main" xmlns:pic="http://schemas.openxmlformats.org/drawingml/2006/picture">
+                  <wp:extent cx="2615184" cy="1898826"/>
+                  <wp:docPr id="170737822" name="Figure 9(c)" descr="图9(c) 平均总调整成本"/>
+                  <wp:cNvGraphicFramePr>
+                    <a:graphicFrameLocks noChangeAspect="1"/>
+                  </wp:cNvGraphicFramePr>
+                  <a:graphic>
+                    <a:graphicData uri="http://schemas.openxmlformats.org/drawingml/2006/picture">
+                      <pic:pic>
+                        <pic:nvPicPr>
+                          <pic:cNvPr id="0" name="figure9_c.png"/>
+                          <pic:cNvPicPr/>
+                        </pic:nvPicPr>
+                        <pic:blipFill>
+                          <a:blip r:embed="rId82"/>
+                          <a:stretch>
+                            <a:fillRect/>
+                          </a:stretch>
+                        </pic:blipFill>
+                        <pic:spPr>
+                          <a:xfrm>
+                            <a:off x="0" y="0"/>
+                            <a:ext cx="2615184" cy="1898826"/>
+                          </a:xfrm>
+                          <a:prstGeom prst="rect"/>
+                        </pic:spPr>
+                      </pic:pic>
+                    </a:graphicData>
+                  </a:graphic>
+                </wp:inline>
+              </w:drawing>
+            </w:r>
+          </w:p>
+          <w:p>
+            <w:pPr>
+              <w:spacing w:before="0" w:after="40" w:line="240" w:lineRule="auto"/>
+              <w:jc w:val="center"/>
+            </w:pPr>
+            <w:r>
+              <w:rPr>
+                <w:rFonts w:ascii="Times New Roman" w:hAnsi="Times New Roman"/>
+                <w:b/>
+                <w:sz w:val="19"/>
+              </w:rPr>
+              <w:t>(c)</w:t>
+            </w:r>
+          </w:p>
+        </w:tc>
+        <w:tc>
+          <w:tcPr>
+            <w:tcW w:type="dxa" w:w="4500"/>
+            <w:vAlign w:val="center"/>
+            <w:tcMar>
+              <w:top w:w="40" w:type="dxa"/>
+              <w:start w:w="40" w:type="dxa"/>
+              <w:bottom w:w="20" w:type="dxa"/>
+              <w:end w:w="40" w:type="dxa"/>
+            </w:tcMar>
+          </w:tcPr>
+          <w:p>
+            <w:pPr>
+              <w:spacing w:before="0" w:after="0" w:line="240" w:lineRule="auto"/>
+              <w:jc w:val="center"/>
+            </w:pPr>
+            <w:r>
+              <w:drawing>
+                <wp:inline xmlns:a="http://schemas.openxmlformats.org/drawingml/2006/main" xmlns:pic="http://schemas.openxmlformats.org/drawingml/2006/picture">
+                  <wp:extent cx="2615184" cy="1898826"/>
+                  <wp:docPr id="170737823" name="Figure 9(d)" descr="图9(d) 平均回合奖励"/>
+                  <wp:cNvGraphicFramePr>
+                    <a:graphicFrameLocks noChangeAspect="1"/>
+                  </wp:cNvGraphicFramePr>
+                  <a:graphic>
+                    <a:graphicData uri="http://schemas.openxmlformats.org/drawingml/2006/picture">
+                      <pic:pic>
+                        <pic:nvPicPr>
+                          <pic:cNvPr id="0" name="figure9_d.png"/>
+                          <pic:cNvPicPr/>
+                        </pic:nvPicPr>
+                        <pic:blipFill>
+                          <a:blip r:embed="rId83"/>
+                          <a:stretch>
+                            <a:fillRect/>
+                          </a:stretch>
+                        </pic:blipFill>
+                        <pic:spPr>
+                          <a:xfrm>
+                            <a:off x="0" y="0"/>
+                            <a:ext cx="2615184" cy="1898826"/>
+                          </a:xfrm>
+                          <a:prstGeom prst="rect"/>
+                        </pic:spPr>
+                      </pic:pic>
+                    </a:graphicData>
+                  </a:graphic>
+                </wp:inline>
+              </w:drawing>
+            </w:r>
+          </w:p>
+          <w:p>
+            <w:pPr>
+              <w:spacing w:before="0" w:after="40" w:line="240" w:lineRule="auto"/>
+              <w:jc w:val="center"/>
+            </w:pPr>
+            <w:r>
+              <w:rPr>
+                <w:rFonts w:ascii="Times New Roman" w:hAnsi="Times New Roman"/>
+                <w:b/>
+                <w:sz w:val="19"/>
+              </w:rPr>
+              <w:t>(d)</w:t>
+            </w:r>
+          </w:p>
+        </w:tc>
+      </w:tr>
+    </w:tbl>
     <w:p>
       <w:pPr>
         <w:pStyle w:val="afffc"/>
+        <w:keepNext w:val="0"/>
         <w:keepLines/>
         <w:widowControl w:val="0"/>
         <w:spacing w:before="20" w:after="20"/>
@@ -32728,190 +33145,304 @@
         <w:ind w:firstLine="420"/>
       </w:pPr>
     </w:p>
-    <w:p>
-      <w:pPr>
-        <w:keepNext/>
-        <w:keepLines/>
+    <w:tbl>
+      <w:tblPr>
+        <w:tblW w:type="dxa" w:w="9000"/>
         <w:jc w:val="center"/>
-      </w:pPr>
-      <w:r>
-        <w:rPr>
-          <w:noProof/>
-        </w:rPr>
-        <w:lastRenderedPageBreak/>
-        <w:drawing>
-          <wp:inline distT="0" distB="0" distL="0" distR="0" wp14:anchorId="66E54698" wp14:editId="04D219B4">
-            <wp:extent cx="2788920" cy="1820655"/>
-            <wp:effectExtent l="0" t="0" r="0" b="0"/>
-            <wp:docPr id="170737804" name="Figure 10(a)" descr="图10(a) 成功率增益"/>
-            <wp:cNvGraphicFramePr>
-              <a:graphicFrameLocks xmlns:a="http://schemas.openxmlformats.org/drawingml/2006/main" noChangeAspect="1"/>
-            </wp:cNvGraphicFramePr>
-            <a:graphic xmlns:a="http://schemas.openxmlformats.org/drawingml/2006/main">
-              <a:graphicData uri="http://schemas.openxmlformats.org/drawingml/2006/picture">
-                <pic:pic xmlns:pic="http://schemas.openxmlformats.org/drawingml/2006/picture">
-                  <pic:nvPicPr>
-                    <pic:cNvPr id="0" name="figure10_a.png"/>
-                    <pic:cNvPicPr/>
-                  </pic:nvPicPr>
-                  <pic:blipFill>
-                    <a:blip r:embed="rId34"/>
-                    <a:stretch>
-                      <a:fillRect/>
-                    </a:stretch>
-                  </pic:blipFill>
-                  <pic:spPr>
-                    <a:xfrm>
-                      <a:off x="0" y="0"/>
-                      <a:ext cx="2788920" cy="1820655"/>
-                    </a:xfrm>
-                    <a:prstGeom prst="rect">
-                      <a:avLst/>
-                    </a:prstGeom>
-                  </pic:spPr>
-                </pic:pic>
-              </a:graphicData>
-            </a:graphic>
-          </wp:inline>
-        </w:drawing>
-      </w:r>
-      <w:r>
-        <w:t xml:space="preserve"> </w:t>
-      </w:r>
-      <w:r>
-        <w:rPr>
-          <w:noProof/>
-        </w:rPr>
-        <w:drawing>
-          <wp:inline distT="0" distB="0" distL="0" distR="0" wp14:anchorId="0B30B1C3" wp14:editId="66202F20">
-            <wp:extent cx="2788920" cy="1820655"/>
-            <wp:effectExtent l="0" t="0" r="0" b="0"/>
-            <wp:docPr id="170737805" name="Figure 10(b)" descr="图10(b) 节省收敛步数"/>
-            <wp:cNvGraphicFramePr>
-              <a:graphicFrameLocks xmlns:a="http://schemas.openxmlformats.org/drawingml/2006/main" noChangeAspect="1"/>
-            </wp:cNvGraphicFramePr>
-            <a:graphic xmlns:a="http://schemas.openxmlformats.org/drawingml/2006/main">
-              <a:graphicData uri="http://schemas.openxmlformats.org/drawingml/2006/picture">
-                <pic:pic xmlns:pic="http://schemas.openxmlformats.org/drawingml/2006/picture">
-                  <pic:nvPicPr>
-                    <pic:cNvPr id="0" name="figure10_b.png"/>
-                    <pic:cNvPicPr/>
-                  </pic:nvPicPr>
-                  <pic:blipFill>
-                    <a:blip r:embed="rId35"/>
-                    <a:stretch>
-                      <a:fillRect/>
-                    </a:stretch>
-                  </pic:blipFill>
-                  <pic:spPr>
-                    <a:xfrm>
-                      <a:off x="0" y="0"/>
-                      <a:ext cx="2788920" cy="1820655"/>
-                    </a:xfrm>
-                    <a:prstGeom prst="rect">
-                      <a:avLst/>
-                    </a:prstGeom>
-                  </pic:spPr>
-                </pic:pic>
-              </a:graphicData>
-            </a:graphic>
-          </wp:inline>
-        </w:drawing>
-      </w:r>
-    </w:p>
-    <w:p>
-      <w:pPr>
-        <w:keepNext/>
-        <w:keepLines/>
-        <w:jc w:val="center"/>
-      </w:pPr>
-      <w:r>
-        <w:rPr>
-          <w:noProof/>
-        </w:rPr>
-        <w:drawing>
-          <wp:inline distT="0" distB="0" distL="0" distR="0" wp14:anchorId="7BBCBBAF" wp14:editId="12791958">
-            <wp:extent cx="2788920" cy="1820655"/>
-            <wp:effectExtent l="0" t="0" r="0" b="0"/>
-            <wp:docPr id="170737806" name="Figure 10(c)" descr="图10(c) 节省调整成本"/>
-            <wp:cNvGraphicFramePr>
-              <a:graphicFrameLocks xmlns:a="http://schemas.openxmlformats.org/drawingml/2006/main" noChangeAspect="1"/>
-            </wp:cNvGraphicFramePr>
-            <a:graphic xmlns:a="http://schemas.openxmlformats.org/drawingml/2006/main">
-              <a:graphicData uri="http://schemas.openxmlformats.org/drawingml/2006/picture">
-                <pic:pic xmlns:pic="http://schemas.openxmlformats.org/drawingml/2006/picture">
-                  <pic:nvPicPr>
-                    <pic:cNvPr id="0" name="figure10_c.png"/>
-                    <pic:cNvPicPr/>
-                  </pic:nvPicPr>
-                  <pic:blipFill>
-                    <a:blip r:embed="rId36"/>
-                    <a:stretch>
-                      <a:fillRect/>
-                    </a:stretch>
-                  </pic:blipFill>
-                  <pic:spPr>
-                    <a:xfrm>
-                      <a:off x="0" y="0"/>
-                      <a:ext cx="2788920" cy="1820655"/>
-                    </a:xfrm>
-                    <a:prstGeom prst="rect">
-                      <a:avLst/>
-                    </a:prstGeom>
-                  </pic:spPr>
-                </pic:pic>
-              </a:graphicData>
-            </a:graphic>
-          </wp:inline>
-        </w:drawing>
-      </w:r>
-      <w:r>
-        <w:t xml:space="preserve"> </w:t>
-      </w:r>
-      <w:r>
-        <w:rPr>
-          <w:noProof/>
-        </w:rPr>
-        <w:drawing>
-          <wp:inline distT="0" distB="0" distL="0" distR="0" wp14:anchorId="4ACE06AE" wp14:editId="5CE32683">
-            <wp:extent cx="2788920" cy="1820655"/>
-            <wp:effectExtent l="0" t="0" r="0" b="0"/>
-            <wp:docPr id="170737807" name="Figure 10(d)" descr="图10(d) 回合奖励增益"/>
-            <wp:cNvGraphicFramePr>
-              <a:graphicFrameLocks xmlns:a="http://schemas.openxmlformats.org/drawingml/2006/main" noChangeAspect="1"/>
-            </wp:cNvGraphicFramePr>
-            <a:graphic xmlns:a="http://schemas.openxmlformats.org/drawingml/2006/main">
-              <a:graphicData uri="http://schemas.openxmlformats.org/drawingml/2006/picture">
-                <pic:pic xmlns:pic="http://schemas.openxmlformats.org/drawingml/2006/picture">
-                  <pic:nvPicPr>
-                    <pic:cNvPr id="0" name="figure10_d.png"/>
-                    <pic:cNvPicPr/>
-                  </pic:nvPicPr>
-                  <pic:blipFill>
-                    <a:blip r:embed="rId37"/>
-                    <a:stretch>
-                      <a:fillRect/>
-                    </a:stretch>
-                  </pic:blipFill>
-                  <pic:spPr>
-                    <a:xfrm>
-                      <a:off x="0" y="0"/>
-                      <a:ext cx="2788920" cy="1820655"/>
-                    </a:xfrm>
-                    <a:prstGeom prst="rect">
-                      <a:avLst/>
-                    </a:prstGeom>
-                  </pic:spPr>
-                </pic:pic>
-              </a:graphicData>
-            </a:graphic>
-          </wp:inline>
-        </w:drawing>
-      </w:r>
-    </w:p>
+        <w:tblLayout w:type="fixed"/>
+        <w:tblLook w:firstColumn="1" w:firstRow="1" w:lastColumn="0" w:lastRow="0" w:noHBand="0" w:noVBand="1" w:val="04A0"/>
+        <w:tblBorders>
+          <w:top w:val="nil"/>
+          <w:left w:val="nil"/>
+          <w:bottom w:val="nil"/>
+          <w:right w:val="nil"/>
+          <w:insideH w:val="nil"/>
+          <w:insideV w:val="nil"/>
+        </w:tblBorders>
+      </w:tblPr>
+      <w:tblGrid>
+        <w:gridCol w:w="4500"/>
+        <w:gridCol w:w="4500"/>
+      </w:tblGrid>
+      <w:tr>
+        <w:trPr>
+          <w:cantSplit/>
+        </w:trPr>
+        <w:tc>
+          <w:tcPr>
+            <w:tcW w:type="dxa" w:w="4500"/>
+            <w:vAlign w:val="center"/>
+            <w:tcMar>
+              <w:top w:w="40" w:type="dxa"/>
+              <w:start w:w="40" w:type="dxa"/>
+              <w:bottom w:w="20" w:type="dxa"/>
+              <w:end w:w="40" w:type="dxa"/>
+            </w:tcMar>
+          </w:tcPr>
+          <w:p>
+            <w:pPr>
+              <w:spacing w:before="0" w:after="0" w:line="240" w:lineRule="auto"/>
+              <w:jc w:val="center"/>
+            </w:pPr>
+            <w:r>
+              <w:drawing>
+                <wp:inline xmlns:a="http://schemas.openxmlformats.org/drawingml/2006/main" xmlns:pic="http://schemas.openxmlformats.org/drawingml/2006/picture">
+                  <wp:extent cx="2615184" cy="1912073"/>
+                  <wp:docPr id="170737824" name="Figure 10(a)" descr="图10(a) 成功率增益"/>
+                  <wp:cNvGraphicFramePr>
+                    <a:graphicFrameLocks noChangeAspect="1"/>
+                  </wp:cNvGraphicFramePr>
+                  <a:graphic>
+                    <a:graphicData uri="http://schemas.openxmlformats.org/drawingml/2006/picture">
+                      <pic:pic>
+                        <pic:nvPicPr>
+                          <pic:cNvPr id="0" name="figure10_a.png"/>
+                          <pic:cNvPicPr/>
+                        </pic:nvPicPr>
+                        <pic:blipFill>
+                          <a:blip r:embed="rId84"/>
+                          <a:stretch>
+                            <a:fillRect/>
+                          </a:stretch>
+                        </pic:blipFill>
+                        <pic:spPr>
+                          <a:xfrm>
+                            <a:off x="0" y="0"/>
+                            <a:ext cx="2615184" cy="1912073"/>
+                          </a:xfrm>
+                          <a:prstGeom prst="rect"/>
+                        </pic:spPr>
+                      </pic:pic>
+                    </a:graphicData>
+                  </a:graphic>
+                </wp:inline>
+              </w:drawing>
+            </w:r>
+          </w:p>
+          <w:p>
+            <w:pPr>
+              <w:spacing w:before="0" w:after="40" w:line="240" w:lineRule="auto"/>
+              <w:jc w:val="center"/>
+            </w:pPr>
+            <w:r>
+              <w:rPr>
+                <w:rFonts w:ascii="Times New Roman" w:hAnsi="Times New Roman"/>
+                <w:b/>
+                <w:sz w:val="19"/>
+              </w:rPr>
+              <w:t>(a)</w:t>
+            </w:r>
+          </w:p>
+        </w:tc>
+        <w:tc>
+          <w:tcPr>
+            <w:tcW w:type="dxa" w:w="4500"/>
+            <w:vAlign w:val="center"/>
+            <w:tcMar>
+              <w:top w:w="40" w:type="dxa"/>
+              <w:start w:w="40" w:type="dxa"/>
+              <w:bottom w:w="20" w:type="dxa"/>
+              <w:end w:w="40" w:type="dxa"/>
+            </w:tcMar>
+          </w:tcPr>
+          <w:p>
+            <w:pPr>
+              <w:spacing w:before="0" w:after="0" w:line="240" w:lineRule="auto"/>
+              <w:jc w:val="center"/>
+            </w:pPr>
+            <w:r>
+              <w:drawing>
+                <wp:inline xmlns:a="http://schemas.openxmlformats.org/drawingml/2006/main" xmlns:pic="http://schemas.openxmlformats.org/drawingml/2006/picture">
+                  <wp:extent cx="2615184" cy="1912073"/>
+                  <wp:docPr id="170737825" name="Figure 10(b)" descr="图10(b) 节省收敛步数"/>
+                  <wp:cNvGraphicFramePr>
+                    <a:graphicFrameLocks noChangeAspect="1"/>
+                  </wp:cNvGraphicFramePr>
+                  <a:graphic>
+                    <a:graphicData uri="http://schemas.openxmlformats.org/drawingml/2006/picture">
+                      <pic:pic>
+                        <pic:nvPicPr>
+                          <pic:cNvPr id="0" name="figure10_b.png"/>
+                          <pic:cNvPicPr/>
+                        </pic:nvPicPr>
+                        <pic:blipFill>
+                          <a:blip r:embed="rId85"/>
+                          <a:stretch>
+                            <a:fillRect/>
+                          </a:stretch>
+                        </pic:blipFill>
+                        <pic:spPr>
+                          <a:xfrm>
+                            <a:off x="0" y="0"/>
+                            <a:ext cx="2615184" cy="1912073"/>
+                          </a:xfrm>
+                          <a:prstGeom prst="rect"/>
+                        </pic:spPr>
+                      </pic:pic>
+                    </a:graphicData>
+                  </a:graphic>
+                </wp:inline>
+              </w:drawing>
+            </w:r>
+          </w:p>
+          <w:p>
+            <w:pPr>
+              <w:spacing w:before="0" w:after="40" w:line="240" w:lineRule="auto"/>
+              <w:jc w:val="center"/>
+            </w:pPr>
+            <w:r>
+              <w:rPr>
+                <w:rFonts w:ascii="Times New Roman" w:hAnsi="Times New Roman"/>
+                <w:b/>
+                <w:sz w:val="19"/>
+              </w:rPr>
+              <w:t>(b)</w:t>
+            </w:r>
+          </w:p>
+        </w:tc>
+      </w:tr>
+      <w:tr>
+        <w:trPr>
+          <w:cantSplit/>
+        </w:trPr>
+        <w:tc>
+          <w:tcPr>
+            <w:tcW w:type="dxa" w:w="4500"/>
+            <w:vAlign w:val="center"/>
+            <w:tcMar>
+              <w:top w:w="40" w:type="dxa"/>
+              <w:start w:w="40" w:type="dxa"/>
+              <w:bottom w:w="20" w:type="dxa"/>
+              <w:end w:w="40" w:type="dxa"/>
+            </w:tcMar>
+          </w:tcPr>
+          <w:p>
+            <w:pPr>
+              <w:spacing w:before="0" w:after="0" w:line="240" w:lineRule="auto"/>
+              <w:jc w:val="center"/>
+            </w:pPr>
+            <w:r>
+              <w:drawing>
+                <wp:inline xmlns:a="http://schemas.openxmlformats.org/drawingml/2006/main" xmlns:pic="http://schemas.openxmlformats.org/drawingml/2006/picture">
+                  <wp:extent cx="2615184" cy="1912073"/>
+                  <wp:docPr id="170737826" name="Figure 10(c)" descr="图10(c) 节省调整成本"/>
+                  <wp:cNvGraphicFramePr>
+                    <a:graphicFrameLocks noChangeAspect="1"/>
+                  </wp:cNvGraphicFramePr>
+                  <a:graphic>
+                    <a:graphicData uri="http://schemas.openxmlformats.org/drawingml/2006/picture">
+                      <pic:pic>
+                        <pic:nvPicPr>
+                          <pic:cNvPr id="0" name="figure10_c.png"/>
+                          <pic:cNvPicPr/>
+                        </pic:nvPicPr>
+                        <pic:blipFill>
+                          <a:blip r:embed="rId86"/>
+                          <a:stretch>
+                            <a:fillRect/>
+                          </a:stretch>
+                        </pic:blipFill>
+                        <pic:spPr>
+                          <a:xfrm>
+                            <a:off x="0" y="0"/>
+                            <a:ext cx="2615184" cy="1912073"/>
+                          </a:xfrm>
+                          <a:prstGeom prst="rect"/>
+                        </pic:spPr>
+                      </pic:pic>
+                    </a:graphicData>
+                  </a:graphic>
+                </wp:inline>
+              </w:drawing>
+            </w:r>
+          </w:p>
+          <w:p>
+            <w:pPr>
+              <w:spacing w:before="0" w:after="40" w:line="240" w:lineRule="auto"/>
+              <w:jc w:val="center"/>
+            </w:pPr>
+            <w:r>
+              <w:rPr>
+                <w:rFonts w:ascii="Times New Roman" w:hAnsi="Times New Roman"/>
+                <w:b/>
+                <w:sz w:val="19"/>
+              </w:rPr>
+              <w:t>(c)</w:t>
+            </w:r>
+          </w:p>
+        </w:tc>
+        <w:tc>
+          <w:tcPr>
+            <w:tcW w:type="dxa" w:w="4500"/>
+            <w:vAlign w:val="center"/>
+            <w:tcMar>
+              <w:top w:w="40" w:type="dxa"/>
+              <w:start w:w="40" w:type="dxa"/>
+              <w:bottom w:w="20" w:type="dxa"/>
+              <w:end w:w="40" w:type="dxa"/>
+            </w:tcMar>
+          </w:tcPr>
+          <w:p>
+            <w:pPr>
+              <w:spacing w:before="0" w:after="0" w:line="240" w:lineRule="auto"/>
+              <w:jc w:val="center"/>
+            </w:pPr>
+            <w:r>
+              <w:drawing>
+                <wp:inline xmlns:a="http://schemas.openxmlformats.org/drawingml/2006/main" xmlns:pic="http://schemas.openxmlformats.org/drawingml/2006/picture">
+                  <wp:extent cx="2615184" cy="1912073"/>
+                  <wp:docPr id="170737827" name="Figure 10(d)" descr="图10(d) 回合奖励增益"/>
+                  <wp:cNvGraphicFramePr>
+                    <a:graphicFrameLocks noChangeAspect="1"/>
+                  </wp:cNvGraphicFramePr>
+                  <a:graphic>
+                    <a:graphicData uri="http://schemas.openxmlformats.org/drawingml/2006/picture">
+                      <pic:pic>
+                        <pic:nvPicPr>
+                          <pic:cNvPr id="0" name="figure10_d.png"/>
+                          <pic:cNvPicPr/>
+                        </pic:nvPicPr>
+                        <pic:blipFill>
+                          <a:blip r:embed="rId87"/>
+                          <a:stretch>
+                            <a:fillRect/>
+                          </a:stretch>
+                        </pic:blipFill>
+                        <pic:spPr>
+                          <a:xfrm>
+                            <a:off x="0" y="0"/>
+                            <a:ext cx="2615184" cy="1912073"/>
+                          </a:xfrm>
+                          <a:prstGeom prst="rect"/>
+                        </pic:spPr>
+                      </pic:pic>
+                    </a:graphicData>
+                  </a:graphic>
+                </wp:inline>
+              </w:drawing>
+            </w:r>
+          </w:p>
+          <w:p>
+            <w:pPr>
+              <w:spacing w:before="0" w:after="40" w:line="240" w:lineRule="auto"/>
+              <w:jc w:val="center"/>
+            </w:pPr>
+            <w:r>
+              <w:rPr>
+                <w:rFonts w:ascii="Times New Roman" w:hAnsi="Times New Roman"/>
+                <w:b/>
+                <w:sz w:val="19"/>
+              </w:rPr>
+              <w:t>(d)</w:t>
+            </w:r>
+          </w:p>
+        </w:tc>
+      </w:tr>
+    </w:tbl>
     <w:p>
       <w:pPr>
         <w:pStyle w:val="afffc"/>
+        <w:keepNext w:val="0"/>
         <w:keepLines/>
         <w:widowControl w:val="0"/>
         <w:spacing w:before="20" w:after="20"/>
@@ -33933,100 +34464,167 @@
         <w:ind w:firstLine="420"/>
       </w:pPr>
     </w:p>
-    <w:p>
-      <w:pPr>
-        <w:keepNext/>
-        <w:keepLines/>
+    <w:tbl>
+      <w:tblPr>
+        <w:tblW w:type="dxa" w:w="9000"/>
         <w:jc w:val="center"/>
-      </w:pPr>
-      <w:r>
-        <w:rPr>
-          <w:noProof/>
-        </w:rPr>
-        <w:lastRenderedPageBreak/>
-        <w:drawing>
-          <wp:inline distT="0" distB="0" distL="0" distR="0" wp14:anchorId="11495F9C" wp14:editId="46E5AC5A">
-            <wp:extent cx="2788920" cy="2337616"/>
-            <wp:effectExtent l="0" t="0" r="0" b="0"/>
-            <wp:docPr id="170737808" name="Figure 11(a)" descr="图11(a) 训练区间内的最终中心共识"/>
-            <wp:cNvGraphicFramePr>
-              <a:graphicFrameLocks xmlns:a="http://schemas.openxmlformats.org/drawingml/2006/main" noChangeAspect="1"/>
-            </wp:cNvGraphicFramePr>
-            <a:graphic xmlns:a="http://schemas.openxmlformats.org/drawingml/2006/main">
-              <a:graphicData uri="http://schemas.openxmlformats.org/drawingml/2006/picture">
-                <pic:pic xmlns:pic="http://schemas.openxmlformats.org/drawingml/2006/picture">
-                  <pic:nvPicPr>
-                    <pic:cNvPr id="0" name="figure11_a.png"/>
-                    <pic:cNvPicPr/>
-                  </pic:nvPicPr>
-                  <pic:blipFill>
-                    <a:blip r:embed="rId38"/>
-                    <a:stretch>
-                      <a:fillRect/>
-                    </a:stretch>
-                  </pic:blipFill>
-                  <pic:spPr>
-                    <a:xfrm>
-                      <a:off x="0" y="0"/>
-                      <a:ext cx="2788920" cy="2337616"/>
-                    </a:xfrm>
-                    <a:prstGeom prst="rect">
-                      <a:avLst/>
-                    </a:prstGeom>
-                  </pic:spPr>
-                </pic:pic>
-              </a:graphicData>
-            </a:graphic>
-          </wp:inline>
-        </w:drawing>
-      </w:r>
-      <w:r>
-        <w:t xml:space="preserve"> </w:t>
-      </w:r>
-      <w:r>
-        <w:rPr>
-          <w:noProof/>
-        </w:rPr>
-        <w:drawing>
-          <wp:inline distT="0" distB="0" distL="0" distR="0" wp14:anchorId="7411D9E0" wp14:editId="6BE056C4">
-            <wp:extent cx="2788920" cy="2337616"/>
-            <wp:effectExtent l="0" t="0" r="0" b="0"/>
-            <wp:docPr id="170737809" name="Figure 11(b)" descr="图11(b) Hausdorff失真与中心移动一致性"/>
-            <wp:cNvGraphicFramePr>
-              <a:graphicFrameLocks xmlns:a="http://schemas.openxmlformats.org/drawingml/2006/main" noChangeAspect="1"/>
-            </wp:cNvGraphicFramePr>
-            <a:graphic xmlns:a="http://schemas.openxmlformats.org/drawingml/2006/main">
-              <a:graphicData uri="http://schemas.openxmlformats.org/drawingml/2006/picture">
-                <pic:pic xmlns:pic="http://schemas.openxmlformats.org/drawingml/2006/picture">
-                  <pic:nvPicPr>
-                    <pic:cNvPr id="0" name="figure11_b.png"/>
-                    <pic:cNvPicPr/>
-                  </pic:nvPicPr>
-                  <pic:blipFill>
-                    <a:blip r:embed="rId39"/>
-                    <a:stretch>
-                      <a:fillRect/>
-                    </a:stretch>
-                  </pic:blipFill>
-                  <pic:spPr>
-                    <a:xfrm>
-                      <a:off x="0" y="0"/>
-                      <a:ext cx="2788920" cy="2337616"/>
-                    </a:xfrm>
-                    <a:prstGeom prst="rect">
-                      <a:avLst/>
-                    </a:prstGeom>
-                  </pic:spPr>
-                </pic:pic>
-              </a:graphicData>
-            </a:graphic>
-          </wp:inline>
-        </w:drawing>
-      </w:r>
-    </w:p>
+        <w:tblLayout w:type="fixed"/>
+        <w:tblLook w:firstColumn="1" w:firstRow="1" w:lastColumn="0" w:lastRow="0" w:noHBand="0" w:noVBand="1" w:val="04A0"/>
+        <w:tblBorders>
+          <w:top w:val="nil"/>
+          <w:left w:val="nil"/>
+          <w:bottom w:val="nil"/>
+          <w:right w:val="nil"/>
+          <w:insideH w:val="nil"/>
+          <w:insideV w:val="nil"/>
+        </w:tblBorders>
+      </w:tblPr>
+      <w:tblGrid>
+        <w:gridCol w:w="4500"/>
+        <w:gridCol w:w="4500"/>
+      </w:tblGrid>
+      <w:tr>
+        <w:trPr>
+          <w:cantSplit/>
+        </w:trPr>
+        <w:tc>
+          <w:tcPr>
+            <w:tcW w:type="dxa" w:w="4500"/>
+            <w:vAlign w:val="center"/>
+            <w:tcMar>
+              <w:top w:w="40" w:type="dxa"/>
+              <w:start w:w="40" w:type="dxa"/>
+              <w:bottom w:w="20" w:type="dxa"/>
+              <w:end w:w="40" w:type="dxa"/>
+            </w:tcMar>
+          </w:tcPr>
+          <w:p>
+            <w:pPr>
+              <w:spacing w:before="0" w:after="0" w:line="240" w:lineRule="auto"/>
+              <w:jc w:val="center"/>
+            </w:pPr>
+            <w:r>
+              <w:drawing>
+                <wp:inline xmlns:a="http://schemas.openxmlformats.org/drawingml/2006/main" xmlns:pic="http://schemas.openxmlformats.org/drawingml/2006/picture">
+                  <wp:extent cx="2615184" cy="1948834"/>
+                  <wp:docPr id="170737828" name="Figure 11(a)" descr="图11(a) 训练区间内的最终中心共识"/>
+                  <wp:cNvGraphicFramePr>
+                    <a:graphicFrameLocks noChangeAspect="1"/>
+                  </wp:cNvGraphicFramePr>
+                  <a:graphic>
+                    <a:graphicData uri="http://schemas.openxmlformats.org/drawingml/2006/picture">
+                      <pic:pic>
+                        <pic:nvPicPr>
+                          <pic:cNvPr id="0" name="figure11_a.png"/>
+                          <pic:cNvPicPr/>
+                        </pic:nvPicPr>
+                        <pic:blipFill>
+                          <a:blip r:embed="rId88"/>
+                          <a:stretch>
+                            <a:fillRect/>
+                          </a:stretch>
+                        </pic:blipFill>
+                        <pic:spPr>
+                          <a:xfrm>
+                            <a:off x="0" y="0"/>
+                            <a:ext cx="2615184" cy="1948834"/>
+                          </a:xfrm>
+                          <a:prstGeom prst="rect"/>
+                        </pic:spPr>
+                      </pic:pic>
+                    </a:graphicData>
+                  </a:graphic>
+                </wp:inline>
+              </w:drawing>
+            </w:r>
+          </w:p>
+          <w:p>
+            <w:pPr>
+              <w:spacing w:before="0" w:after="40" w:line="240" w:lineRule="auto"/>
+              <w:jc w:val="center"/>
+            </w:pPr>
+            <w:r>
+              <w:rPr>
+                <w:rFonts w:ascii="Times New Roman" w:hAnsi="Times New Roman"/>
+                <w:b/>
+                <w:sz w:val="19"/>
+              </w:rPr>
+              <w:t>(a)</w:t>
+            </w:r>
+          </w:p>
+        </w:tc>
+        <w:tc>
+          <w:tcPr>
+            <w:tcW w:type="dxa" w:w="4500"/>
+            <w:vAlign w:val="center"/>
+            <w:tcMar>
+              <w:top w:w="40" w:type="dxa"/>
+              <w:start w:w="40" w:type="dxa"/>
+              <w:bottom w:w="20" w:type="dxa"/>
+              <w:end w:w="40" w:type="dxa"/>
+            </w:tcMar>
+          </w:tcPr>
+          <w:p>
+            <w:pPr>
+              <w:spacing w:before="0" w:after="0" w:line="240" w:lineRule="auto"/>
+              <w:jc w:val="center"/>
+            </w:pPr>
+            <w:r>
+              <w:drawing>
+                <wp:inline xmlns:a="http://schemas.openxmlformats.org/drawingml/2006/main" xmlns:pic="http://schemas.openxmlformats.org/drawingml/2006/picture">
+                  <wp:extent cx="2615184" cy="2506620"/>
+                  <wp:docPr id="170737829" name="Figure 11(b)" descr="图11(b) Hausdorff失真与中心移动一致性"/>
+                  <wp:cNvGraphicFramePr>
+                    <a:graphicFrameLocks noChangeAspect="1"/>
+                  </wp:cNvGraphicFramePr>
+                  <a:graphic>
+                    <a:graphicData uri="http://schemas.openxmlformats.org/drawingml/2006/picture">
+                      <pic:pic>
+                        <pic:nvPicPr>
+                          <pic:cNvPr id="0" name="figure11_b.png"/>
+                          <pic:cNvPicPr/>
+                        </pic:nvPicPr>
+                        <pic:blipFill>
+                          <a:blip r:embed="rId89"/>
+                          <a:stretch>
+                            <a:fillRect/>
+                          </a:stretch>
+                        </pic:blipFill>
+                        <pic:spPr>
+                          <a:xfrm>
+                            <a:off x="0" y="0"/>
+                            <a:ext cx="2615184" cy="2506620"/>
+                          </a:xfrm>
+                          <a:prstGeom prst="rect"/>
+                        </pic:spPr>
+                      </pic:pic>
+                    </a:graphicData>
+                  </a:graphic>
+                </wp:inline>
+              </w:drawing>
+            </w:r>
+          </w:p>
+          <w:p>
+            <w:pPr>
+              <w:spacing w:before="0" w:after="40" w:line="240" w:lineRule="auto"/>
+              <w:jc w:val="center"/>
+            </w:pPr>
+            <w:r>
+              <w:rPr>
+                <w:rFonts w:ascii="Times New Roman" w:hAnsi="Times New Roman"/>
+                <w:b/>
+                <w:sz w:val="19"/>
+              </w:rPr>
+              <w:t>(b)</w:t>
+            </w:r>
+          </w:p>
+        </w:tc>
+      </w:tr>
+    </w:tbl>
     <w:p>
       <w:pPr>
         <w:pStyle w:val="afffc"/>
+        <w:keepNext w:val="0"/>
         <w:keepLines/>
         <w:widowControl w:val="0"/>
         <w:spacing w:before="20" w:after="20"/>

</xml_diff>

<commit_message>
Fix English authors and repository statement
</commit_message>
<xml_diff>
--- a/paper/IntervalFuzzy-MetaGDM_manuscript_annotated.docx
+++ b/paper/IntervalFuzzy-MetaGDM_manuscript_annotated.docx
@@ -18902,19 +18902,27 @@
       <w:r>
         <w:rPr>
           <w:szCs w:val="21"/>
+          <w:b/>
           <w:noProof/>
         </w:rPr>
-        <w:t>为便于复核，本文使用的训练代码、参数配置、冻结检查点、场景级结果、汇总表和制图脚本已公开于</w:t>
-      </w:r>
-      <w:hyperlink r:id="rId68" w:history="1">
+        <w:t>代码与数据可用性：</w:t>
+      </w:r>
+      <w:r>
+        <w:rPr>
+          <w:szCs w:val="21"/>
+          <w:noProof/>
+        </w:rPr>
+        <w:t>本文使用的训练代码、参数配置、冻结检查点、场景级结果、汇总表和制图脚本均已公开于 GitHub：</w:t>
+      </w:r>
+      <w:hyperlink r:id="rId68">
         <w:r>
           <w:rPr>
             <w:szCs w:val="21"/>
+            <w:noProof/>
             <w:color w:val="0563C1"/>
             <w:u w:val="single"/>
-            <w:noProof/>
           </w:rPr>
-          <w:t>GitHub仓库</w:t>
+          <w:t>https://github.com/songyang531/IntervalFuzzy-MetaGDM</w:t>
         </w:r>
       </w:hyperlink>
       <w:r>
@@ -18922,17 +18930,17 @@
           <w:szCs w:val="21"/>
           <w:noProof/>
         </w:rPr>
-        <w:t>。本文链接固定到提交9029bd51，具体对应关系见</w:t>
-      </w:r>
-      <w:hyperlink r:id="rId69" w:history="1">
+        <w:t>。为保证版本可复核，实验代码与数据链接固定至提交9029bd51；实验与文件的对应关系见</w:t>
+      </w:r>
+      <w:hyperlink r:id="rId69">
         <w:r>
           <w:rPr>
             <w:szCs w:val="21"/>
+            <w:noProof/>
             <w:color w:val="0563C1"/>
             <w:u w:val="single"/>
-            <w:noProof/>
           </w:rPr>
-          <w:t>论文实验—文件映射</w:t>
+          <w:t>PAPER_EXPERIMENT_MAP.md</w:t>
         </w:r>
       </w:hyperlink>
       <w:r>
@@ -57467,14 +57475,14 @@
         <w:rPr>
           <w:rFonts w:hAnsi="Times New Roman"/>
         </w:rPr>
-        <w:t>Mingshuo Cao</w:t>
+        <w:t>Yang Song</w:t>
       </w:r>
       <w:r>
         <w:rPr>
           <w:rFonts w:hAnsi="Times New Roman"/>
           <w:vertAlign w:val="superscript"/>
         </w:rPr>
-        <w:t>1</w:t>
+        <w:t>2</w:t>
       </w:r>
       <w:r>
         <w:rPr>
@@ -57484,28 +57492,9 @@
       </w:r>
       <w:r>
         <w:rPr>
-          <w:rFonts w:hAnsi="Times New Roman" w:hint="eastAsia"/>
-        </w:rPr>
-        <w:t>Yang Song</w:t>
-      </w:r>
-      <w:r>
-        <w:rPr>
           <w:rFonts w:hAnsi="Times New Roman"/>
-          <w:vertAlign w:val="superscript"/>
-        </w:rPr>
-        <w:t>2</w:t>
-      </w:r>
-      <w:r>
-        <w:rPr>
-          <w:rFonts w:hAnsi="Times New Roman"/>
-        </w:rPr>
-        <w:t>，</w:t>
-      </w:r>
-      <w:r>
-        <w:rPr>
-          <w:rFonts w:hAnsi="Times New Roman"/>
-        </w:rPr>
-        <w:t>Jie Yang</w:t>
+        </w:rPr>
+        <w:t>Mingshuo Cao</w:t>
       </w:r>
       <w:r>
         <w:rPr>
@@ -57597,6 +57586,21 @@
       </w:pPr>
       <w:r>
         <w:t>In public governance, organizational negotiation, and resource allocation, members often express preferences as admissible ranges rather than single precise values, while their responses vary with acceptance tendencies, behavioral inertia, and cost sensitivity. This study extends continuous-control Meta-GDM with interval-valued fuzzy preferences, context encoding, and social attention. Each preference is represented by a center and a half-width, and consensus, outlier deviation, and boundary risk are computed from both endpoints. A Transformer and a variational latent variable encode suggestions, realized adjustments, and rewards from the last ten rounds. The resulting response representation is combined with the current interval state in a permutation-invariant social-attention module, and a shared actor generates member-specific continuous suggestions. The model is trained for 5,000 episodes only at N=10 and then evaluated with frozen parameters on 50 scenarios at each of N=10, 40, and 100. In static homogeneous settings, the proposed model and deterministic rules all reach a 1.00 success rate; at N=40 and N=100, the proposed model achieves the highest mean reward and the lowest cost Gini among the deterministic methods. Under hidden response heterogeneity, its success rates are 0.98, 1.00, and 1.00, exceeding the strongest rule by 18, 36, and 64 percentage points, while reducing mean termination steps by 21.92, 45.28, and 72.84. At N=40, the proposed model reaches a 1.00 success rate, whereas PPO, DDPG, and SAC fail within 120 rounds. The frozen policy trained at N=10 also transfers directly to N=40 and N=100, with a 1.00 success rate at both scales. Masking the real interaction history at inference reduces success by 14, 22, and 44 percentage points, showing that context provides essential information for adapting to unobserved behavioral differences. Interval audits show zero mean half-width change and a maximum Hausdorff-center discrepancy of 1.11 × 10⁻¹⁶. These results demonstrate that the proposed model is particularly effective for heterogeneous, history-dependent, and cross-scale consensus tasks while preserving interval uncertainty. Its higher total adjustment cost under hidden heterogeneity remains an important tradeoff for further optimization.</w:t>
+      </w:r>
+      <w:r>
+        <w:t xml:space="preserve"> Code and data are available at </w:t>
+      </w:r>
+      <w:hyperlink r:id="rId68">
+        <w:r>
+          <w:rPr>
+            <w:color w:val="0563C1"/>
+            <w:u w:val="single"/>
+          </w:rPr>
+          <w:t>https://github.com/songyang531/IntervalFuzzy-MetaGDM</w:t>
+        </w:r>
+      </w:hyperlink>
+      <w:r>
+        <w:t>.</w:t>
       </w:r>
     </w:p>
     <w:p>

</xml_diff>